<commit_message>
Publicacion en GitHub, link en los entregables y verificador de rubrica
- Se agrega el link del repositorio al README, al informe y a la portada de la
  presentacion. Era el entregable que faltaba segun la guia del curso, que pide
  versionar en GitHub porque las contribuciones se usan para la evaluacion
  individual de cada integrante.
- scripts/verificar_rubrica.py: comprueba sobre el propio notebook los 21
  criterios de la rubrica, cuatro salvaguardas metodologicas y que ninguna celda
  haya quedado sin ejecutar. Sale con codigo 1 si algo falta.
- Informe y presentacion regenerados con el link incluido.

Verificado: el notebook se regenera identico desde un clon limpio (84 celdas,
fuentes iguales) y ningun CSV del reto quedo versionado.
</commit_message>
<xml_diff>
--- a/docs/Informe_Analisis_Exploratorio.docx
+++ b/docs/Informe_Analisis_Exploratorio.docx
@@ -173,7 +173,25 @@
         <w:t xml:space="preserve"> </w:t>
       </w:r>
       <w:r>
-        <w:t xml:space="preserve">se citan. A lo largo del documento se distingue explícitamente entre lo que se</w:t>
+        <w:t xml:space="preserve">se citan. El código, el notebook ejecutado y los entregables están versionados en:</w:t>
+      </w:r>
+    </w:p>
+    <w:p>
+      <w:pPr>
+        <w:pStyle w:val="BlockText"/>
+      </w:pPr>
+      <w:r>
+        <w:rPr>
+          <w:b/>
+          <w:bCs/>
+        </w:rPr>
+        <w:t xml:space="preserve">https://github.com/Javiervalladares1/CC3084-Proyecto2-Drought-EDA</w:t>
+      </w:r>
+      <w:r>
+        <w:t xml:space="preserve"> </w:t>
+      </w:r>
+      <w:r>
+        <w:t xml:space="preserve">A lo largo del documento se distingue explícitamente entre lo que se</w:t>
       </w:r>
       <w:r>
         <w:t xml:space="preserve"> </w:t>

</xml_diff>

<commit_message>
Corrige el informe y automatiza su generacion en docx y pdf
Correcciones de contenido:
- Al insertar el link del repositorio, la cita se comio el parrafo siguiente por
  continuacion perezosa de Markdown: "A lo largo del documento se distingue..."
  quedo dentro del blockquote. Ahora son dos parrafos separados.
- El indice decia "Table of Contents" en un documento en espanol, y salia vacio
  porque pandoc emite un campo TOC de Word que ningun visor rellena solo. Se
  reemplaza por un indice estatico en espanol que siempre se muestra.
- Se agrega portada con salto de pagina, tabla de integrantes por completar y el
  link del repositorio.

- scripts/crear_informe.py: genera el .docx y el .pdf desde el mismo Markdown,
  para que no puedan quedar desincronizados.
- .gitignore: se excluyen los archivos de bloqueo ~$ de Word y PowerPoint.

Verificado: 13 paginas, indice en espanol y poblado, las 12 secciones presentes,
5 figuras embebidas y el link en portada e introduccion.
</commit_message>
<xml_diff>
--- a/docs/Informe_Analisis_Exploratorio.docx
+++ b/docs/Informe_Analisis_Exploratorio.docx
@@ -26,573 +26,224 @@
         <w:t xml:space="preserve">CC3084 — Data Science · Universidad del Valle de Guatemala · Semestre II 2026</w:t>
       </w:r>
     </w:p>
-    <w:sdt>
-      <w:sdtPr>
-        <w:docPartObj>
-          <w:docPartGallery w:val="Table of Contents"/>
-          <w:docPartUnique/>
-        </w:docPartObj>
-      </w:sdtPr>
-      <w:sdtContent>
-        <w:p>
-          <w:pPr>
-            <w:pStyle w:val="TOCHeading"/>
-          </w:pPr>
-          <w:r>
-            <w:t xml:space="preserve">Table of Contents</w:t>
-          </w:r>
-        </w:p>
-        <w:p>
-          <w:r>
-            <w:fldChar w:fldCharType="begin" w:dirty="true"/>
-            <w:instrText xml:space="preserve">TOC \o "1-3" \h \z \u</w:instrText>
-            <w:fldChar w:fldCharType="separate"/>
-            <w:fldChar w:fldCharType="end"/>
-          </w:r>
-        </w:p>
-      </w:sdtContent>
-    </w:sdt>
-    <w:bookmarkStart w:id="9" w:name="introducción"/>
-    <w:p>
-      <w:pPr>
-        <w:pStyle w:val="Heading1"/>
-      </w:pPr>
-      <w:r>
-        <w:t xml:space="preserve">1. Introducción</w:t>
-      </w:r>
-    </w:p>
     <w:p>
       <w:pPr>
         <w:pStyle w:val="FirstParagraph"/>
       </w:pPr>
       <w:r>
-        <w:t xml:space="preserve">Este informe presenta el análisis exploratorio de datos del reto</w:t>
-      </w:r>
-      <w:r>
-        <w:t xml:space="preserve"> </w:t>
-      </w:r>
-      <w:r>
-        <w:rPr>
-          <w:i/>
-          <w:iCs/>
-        </w:rPr>
-        <w:t xml:space="preserve">A Step Ahead of</w:t>
-      </w:r>
-      <w:r>
-        <w:rPr>
-          <w:i/>
-          <w:iCs/>
-        </w:rPr>
-        <w:t xml:space="preserve"> </w:t>
-      </w:r>
-      <w:r>
-        <w:rPr>
-          <w:i/>
-          <w:iCs/>
-        </w:rPr>
-        <w:t xml:space="preserve">Drought: Forecasting Global Water Storage Challenge</w:t>
-      </w:r>
-      <w:r>
-        <w:t xml:space="preserve">, organizado por la</w:t>
-      </w:r>
-      <w:r>
-        <w:t xml:space="preserve"> </w:t>
-      </w:r>
-      <w:r>
-        <w:t xml:space="preserve">International Telecommunication Union (ITU) junto con agencias del Sistema de</w:t>
-      </w:r>
-      <w:r>
-        <w:t xml:space="preserve"> </w:t>
-      </w:r>
-      <w:r>
-        <w:t xml:space="preserve">Naciones Unidas y alojado en la plataforma Zindi. El reto pertenece a la</w:t>
-      </w:r>
-      <w:r>
-        <w:t xml:space="preserve"> </w:t>
-      </w:r>
-      <w:r>
-        <w:t xml:space="preserve">categoría de</w:t>
-      </w:r>
-      <w:r>
-        <w:t xml:space="preserve"> </w:t>
-      </w:r>
-      <w:r>
-        <w:rPr>
-          <w:b/>
-          <w:bCs/>
-        </w:rPr>
-        <w:t xml:space="preserve">series de tiempo con datos satelitales</w:t>
-      </w:r>
-      <w:r>
-        <w:t xml:space="preserve">.</w:t>
-      </w:r>
-    </w:p>
+        <w:rPr>
+          <w:b/>
+          <w:bCs/>
+        </w:rPr>
+        <w:t xml:space="preserve">Integrantes</w:t>
+      </w:r>
+    </w:p>
+    <w:tbl>
+      <w:tblPr>
+        <w:tblStyle w:val="Table"/>
+        <w:tblW w:type="auto" w:w="0"/>
+        <w:tblLook w:firstRow="1" w:lastRow="0" w:firstColumn="0" w:lastColumn="0" w:noHBand="0" w:noVBand="0" w:val="0020"/>
+      </w:tblPr>
+      <w:tblGrid>
+        <w:gridCol w:w="2640"/>
+        <w:gridCol w:w="2640"/>
+        <w:gridCol w:w="2640"/>
+      </w:tblGrid>
+      <w:tr>
+        <w:trPr>
+          <w:tblHeader w:val="on"/>
+        </w:trPr>
+        <w:tc>
+          <w:tcPr/>
+          <w:p>
+            <w:pPr>
+              <w:pStyle w:val="Compact"/>
+              <w:jc w:val="center"/>
+            </w:pPr>
+            <w:r>
+              <w:t xml:space="preserve">#</w:t>
+            </w:r>
+          </w:p>
+        </w:tc>
+        <w:tc>
+          <w:tcPr/>
+          <w:p>
+            <w:pPr>
+              <w:pStyle w:val="Compact"/>
+            </w:pPr>
+            <w:r>
+              <w:t xml:space="preserve">Nombre</w:t>
+            </w:r>
+          </w:p>
+        </w:tc>
+        <w:tc>
+          <w:tcPr/>
+          <w:p>
+            <w:pPr>
+              <w:pStyle w:val="Compact"/>
+            </w:pPr>
+            <w:r>
+              <w:t xml:space="preserve">Carné</w:t>
+            </w:r>
+          </w:p>
+        </w:tc>
+      </w:tr>
+      <w:tr>
+        <w:tc>
+          <w:tcPr/>
+          <w:p>
+            <w:pPr>
+              <w:pStyle w:val="Compact"/>
+              <w:jc w:val="center"/>
+            </w:pPr>
+            <w:r>
+              <w:t xml:space="preserve">1</w:t>
+            </w:r>
+          </w:p>
+        </w:tc>
+        <w:tc>
+          <w:tcPr/>
+          <w:p>
+            <w:pPr>
+              <w:pStyle w:val="Compact"/>
+            </w:pPr>
+          </w:p>
+        </w:tc>
+        <w:tc>
+          <w:tcPr/>
+          <w:p>
+            <w:pPr>
+              <w:pStyle w:val="Compact"/>
+            </w:pPr>
+          </w:p>
+        </w:tc>
+      </w:tr>
+      <w:tr>
+        <w:tc>
+          <w:tcPr/>
+          <w:p>
+            <w:pPr>
+              <w:pStyle w:val="Compact"/>
+              <w:jc w:val="center"/>
+            </w:pPr>
+            <w:r>
+              <w:t xml:space="preserve">2</w:t>
+            </w:r>
+          </w:p>
+        </w:tc>
+        <w:tc>
+          <w:tcPr/>
+          <w:p>
+            <w:pPr>
+              <w:pStyle w:val="Compact"/>
+            </w:pPr>
+          </w:p>
+        </w:tc>
+        <w:tc>
+          <w:tcPr/>
+          <w:p>
+            <w:pPr>
+              <w:pStyle w:val="Compact"/>
+            </w:pPr>
+          </w:p>
+        </w:tc>
+      </w:tr>
+      <w:tr>
+        <w:tc>
+          <w:tcPr/>
+          <w:p>
+            <w:pPr>
+              <w:pStyle w:val="Compact"/>
+              <w:jc w:val="center"/>
+            </w:pPr>
+            <w:r>
+              <w:t xml:space="preserve">3</w:t>
+            </w:r>
+          </w:p>
+        </w:tc>
+        <w:tc>
+          <w:tcPr/>
+          <w:p>
+            <w:pPr>
+              <w:pStyle w:val="Compact"/>
+            </w:pPr>
+          </w:p>
+        </w:tc>
+        <w:tc>
+          <w:tcPr/>
+          <w:p>
+            <w:pPr>
+              <w:pStyle w:val="Compact"/>
+            </w:pPr>
+          </w:p>
+        </w:tc>
+      </w:tr>
+      <w:tr>
+        <w:tc>
+          <w:tcPr/>
+          <w:p>
+            <w:pPr>
+              <w:pStyle w:val="Compact"/>
+              <w:jc w:val="center"/>
+            </w:pPr>
+            <w:r>
+              <w:t xml:space="preserve">4</w:t>
+            </w:r>
+          </w:p>
+        </w:tc>
+        <w:tc>
+          <w:tcPr/>
+          <w:p>
+            <w:pPr>
+              <w:pStyle w:val="Compact"/>
+            </w:pPr>
+          </w:p>
+        </w:tc>
+        <w:tc>
+          <w:tcPr/>
+          <w:p>
+            <w:pPr>
+              <w:pStyle w:val="Compact"/>
+            </w:pPr>
+          </w:p>
+        </w:tc>
+      </w:tr>
+    </w:tbl>
     <w:p>
       <w:pPr>
         <w:pStyle w:val="BodyText"/>
       </w:pPr>
       <w:r>
-        <w:t xml:space="preserve">El objetivo de esta etapa no es construir el modelo de pronóstico, sino</w:t>
-      </w:r>
-      <w:r>
-        <w:t xml:space="preserve"> </w:t>
-      </w:r>
-      <w:r>
-        <w:t xml:space="preserve">comprender el fenómeno estudiado, la estructura del conjunto de datos y los</w:t>
-      </w:r>
-      <w:r>
-        <w:t xml:space="preserve"> </w:t>
-      </w:r>
-      <w:r>
-        <w:t xml:space="preserve">patrones que permitirán, en una fase posterior, plantear un modelo con criterio.</w:t>
-      </w:r>
-    </w:p>
-    <w:p>
-      <w:pPr>
-        <w:pStyle w:val="BodyText"/>
-      </w:pPr>
-      <w:r>
-        <w:t xml:space="preserve">Todo el análisis es reproducible: el cuaderno</w:t>
-      </w:r>
-      <w:r>
-        <w:t xml:space="preserve"> </w:t>
-      </w:r>
-      <w:r>
-        <w:rPr>
-          <w:rStyle w:val="VerbatimChar"/>
-        </w:rPr>
-        <w:t xml:space="preserve">Proyecto2_Analisis_Exploratorio.ipynb</w:t>
-      </w:r>
-      <w:r>
-        <w:t xml:space="preserve"> </w:t>
-      </w:r>
-      <w:r>
-        <w:t xml:space="preserve">se ejecuta de principio a fin sin errores y genera las tablas y figuras que aquí</w:t>
-      </w:r>
-      <w:r>
-        <w:t xml:space="preserve"> </w:t>
-      </w:r>
-      <w:r>
-        <w:t xml:space="preserve">se citan. El código, el notebook ejecutado y los entregables están versionados en:</w:t>
-      </w:r>
-    </w:p>
-    <w:p>
-      <w:pPr>
-        <w:pStyle w:val="BlockText"/>
-      </w:pPr>
-      <w:r>
-        <w:rPr>
-          <w:b/>
-          <w:bCs/>
-        </w:rPr>
-        <w:t xml:space="preserve">https://github.com/Javiervalladares1/CC3084-Proyecto2-Drought-EDA</w:t>
-      </w:r>
-      <w:r>
-        <w:t xml:space="preserve"> </w:t>
-      </w:r>
-      <w:r>
-        <w:t xml:space="preserve">A lo largo del documento se distingue explícitamente entre lo que se</w:t>
-      </w:r>
-      <w:r>
-        <w:t xml:space="preserve"> </w:t>
-      </w:r>
-      <w:r>
-        <w:t xml:space="preserve">observa en los datos y la información tomada de fuentes externas.</w:t>
-      </w:r>
-    </w:p>
-    <w:bookmarkEnd w:id="9"/>
-    <w:bookmarkStart w:id="10" w:name="situación-problemática"/>
-    <w:p>
-      <w:pPr>
-        <w:pStyle w:val="Heading1"/>
-      </w:pPr>
-      <w:r>
-        <w:t xml:space="preserve">2. Situación problemática</w:t>
-      </w:r>
-    </w:p>
-    <w:p>
-      <w:pPr>
-        <w:pStyle w:val="FirstParagraph"/>
-      </w:pPr>
-      <w:r>
-        <w:t xml:space="preserve">El agua dulce disponible no está distribuida de manera uniforme ni es constante</w:t>
-      </w:r>
-      <w:r>
-        <w:t xml:space="preserve"> </w:t>
-      </w:r>
-      <w:r>
-        <w:t xml:space="preserve">en el tiempo. Su disponibilidad depende del balance entre la precipitación</w:t>
-      </w:r>
-      <w:r>
-        <w:t xml:space="preserve"> </w:t>
-      </w:r>
-      <w:r>
-        <w:t xml:space="preserve">recibida y las pérdidas por evapotranspiración y escorrentía, y ese balance se</w:t>
-      </w:r>
-      <w:r>
-        <w:t xml:space="preserve"> </w:t>
-      </w:r>
-      <w:r>
-        <w:t xml:space="preserve">acumula durante meses o años en el suelo, en los cuerpos de agua superficiales y</w:t>
-      </w:r>
-      <w:r>
-        <w:t xml:space="preserve"> </w:t>
-      </w:r>
-      <w:r>
-        <w:t xml:space="preserve">en los acuíferos. Cuando permanece negativo de forma prolongada aparece la</w:t>
-      </w:r>
-      <w:r>
-        <w:t xml:space="preserve"> </w:t>
-      </w:r>
-      <w:r>
-        <w:rPr>
-          <w:b/>
-          <w:bCs/>
-        </w:rPr>
-        <w:t xml:space="preserve">sequía hidrológica</w:t>
-      </w:r>
-      <w:r>
-        <w:t xml:space="preserve">: una reducción sostenida del agua efectivamente almacenada</w:t>
-      </w:r>
-      <w:r>
-        <w:t xml:space="preserve"> </w:t>
-      </w:r>
-      <w:r>
-        <w:t xml:space="preserve">en un territorio.</w:t>
-      </w:r>
-    </w:p>
-    <w:p>
-      <w:pPr>
-        <w:pStyle w:val="BodyText"/>
-      </w:pPr>
-      <w:r>
-        <w:t xml:space="preserve">El problema práctico es que esa reducción no se observa con facilidad. La lluvia</w:t>
-      </w:r>
-      <w:r>
-        <w:t xml:space="preserve"> </w:t>
-      </w:r>
-      <w:r>
-        <w:t xml:space="preserve">se mide bien, pero no describe por sí sola el estado del sistema: una región</w:t>
-      </w:r>
-      <w:r>
-        <w:t xml:space="preserve"> </w:t>
-      </w:r>
-      <w:r>
-        <w:t xml:space="preserve">puede recibir precipitación normal y seguir agotándose si la demanda evaporativa</w:t>
-      </w:r>
-      <w:r>
-        <w:t xml:space="preserve"> </w:t>
-      </w:r>
-      <w:r>
-        <w:t xml:space="preserve">es alta o si la extracción de agua subterránea excede la recarga. Medir</w:t>
-      </w:r>
-      <w:r>
-        <w:t xml:space="preserve"> </w:t>
-      </w:r>
-      <w:r>
-        <w:t xml:space="preserve">directamente el agua almacenada exigiría una red de observación que a escala</w:t>
-      </w:r>
-      <w:r>
-        <w:t xml:space="preserve"> </w:t>
-      </w:r>
-      <w:r>
-        <w:t xml:space="preserve">global no existe con cobertura suficiente.</w:t>
-      </w:r>
-    </w:p>
-    <w:p>
-      <w:pPr>
-        <w:pStyle w:val="BodyText"/>
-      </w:pPr>
-      <w:r>
-        <w:t xml:space="preserve">Los datos satelitales cambian ese planteamiento. Las misiones</w:t>
-      </w:r>
-      <w:r>
-        <w:t xml:space="preserve"> </w:t>
-      </w:r>
-      <w:r>
-        <w:rPr>
-          <w:b/>
-          <w:bCs/>
-        </w:rPr>
-        <w:t xml:space="preserve">GRACE</w:t>
-      </w:r>
-      <w:r>
-        <w:t xml:space="preserve"> </w:t>
-      </w:r>
-      <w:r>
-        <w:t xml:space="preserve">(2002–2017)</w:t>
-      </w:r>
-      <w:r>
-        <w:t xml:space="preserve"> </w:t>
-      </w:r>
-      <w:r>
-        <w:t xml:space="preserve">y</w:t>
-      </w:r>
-      <w:r>
-        <w:t xml:space="preserve"> </w:t>
-      </w:r>
-      <w:r>
-        <w:rPr>
-          <w:b/>
-          <w:bCs/>
-        </w:rPr>
-        <w:t xml:space="preserve">GRACE-FO</w:t>
-      </w:r>
-      <w:r>
-        <w:t xml:space="preserve"> </w:t>
-      </w:r>
-      <w:r>
-        <w:t xml:space="preserve">(desde 2018) estiman el almacenamiento total de agua de forma</w:t>
-      </w:r>
-      <w:r>
-        <w:t xml:space="preserve"> </w:t>
-      </w:r>
-      <w:r>
-        <w:t xml:space="preserve">indirecta, midiendo variaciones del campo gravitatorio terrestre. Proporcionan</w:t>
-      </w:r>
-      <w:r>
-        <w:t xml:space="preserve"> </w:t>
-      </w:r>
-      <w:r>
-        <w:t xml:space="preserve">una variable comparable entre regiones que integra agua superficial y subterránea.</w:t>
-      </w:r>
-    </w:p>
-    <w:p>
-      <w:pPr>
-        <w:pStyle w:val="BodyText"/>
-      </w:pPr>
-      <w:r>
-        <w:t xml:space="preserve">Sin embargo, esta solución trae una limitación operativa. Según la descripción</w:t>
-      </w:r>
-      <w:r>
-        <w:t xml:space="preserve"> </w:t>
-      </w:r>
-      <w:r>
-        <w:t xml:space="preserve">oficial del reto, los productos derivados de GRACE se publican con un</w:t>
-      </w:r>
-      <w:r>
-        <w:t xml:space="preserve"> </w:t>
-      </w:r>
-      <w:r>
-        <w:rPr>
-          <w:b/>
-          <w:bCs/>
-        </w:rPr>
-        <w:t xml:space="preserve">retraso de</w:t>
-      </w:r>
-      <w:r>
-        <w:rPr>
-          <w:b/>
-          <w:bCs/>
-        </w:rPr>
-        <w:t xml:space="preserve"> </w:t>
-      </w:r>
-      <w:r>
-        <w:rPr>
-          <w:b/>
-          <w:bCs/>
-        </w:rPr>
-        <w:t xml:space="preserve">aproximadamente 2 a 3 meses</w:t>
-      </w:r>
-      <w:r>
-        <w:t xml:space="preserve">. Para monitoreo y alerta temprana se necesita</w:t>
-      </w:r>
-      <w:r>
-        <w:t xml:space="preserve"> </w:t>
-      </w:r>
-      <w:r>
-        <w:t xml:space="preserve">conocer el estado actual del sistema, y lo disponible es el estado de hace un</w:t>
-      </w:r>
-      <w:r>
-        <w:t xml:space="preserve"> </w:t>
-      </w:r>
-      <w:r>
-        <w:t xml:space="preserve">trimestre: la información existe, pero llega tarde para sostener una decisión.</w:t>
-      </w:r>
-    </w:p>
-    <w:p>
-      <w:pPr>
-        <w:pStyle w:val="BodyText"/>
-      </w:pPr>
-      <w:r>
-        <w:t xml:space="preserve">Anticipar el almacenamiento futuro no es trivial. El comportamiento del agua</w:t>
-      </w:r>
-      <w:r>
-        <w:t xml:space="preserve"> </w:t>
-      </w:r>
-      <w:r>
-        <w:t xml:space="preserve">almacenada no es homogéneo en el espacio; la señal combina tendencia,</w:t>
-      </w:r>
-      <w:r>
-        <w:t xml:space="preserve"> </w:t>
-      </w:r>
-      <w:r>
-        <w:t xml:space="preserve">estacionalidad y variabilidad interanual; las covariables de baja latencia</w:t>
-      </w:r>
-      <w:r>
-        <w:t xml:space="preserve"> </w:t>
-      </w:r>
-      <w:r>
-        <w:t xml:space="preserve">describen sobre todo la parte superficial del ciclo hidrológico, mientras el TWS</w:t>
-      </w:r>
-      <w:r>
-        <w:t xml:space="preserve"> </w:t>
-      </w:r>
-      <w:r>
-        <w:t xml:space="preserve">incluye componentes de respuesta lenta; y los registros satelitales presentan</w:t>
-      </w:r>
-      <w:r>
-        <w:t xml:space="preserve"> </w:t>
-      </w:r>
-      <w:r>
-        <w:t xml:space="preserve">interrupciones.</w:t>
-      </w:r>
-    </w:p>
-    <w:bookmarkEnd w:id="10"/>
-    <w:bookmarkStart w:id="11" w:name="problema-científico"/>
-    <w:p>
-      <w:pPr>
-        <w:pStyle w:val="Heading1"/>
-      </w:pPr>
-      <w:r>
-        <w:t xml:space="preserve">3. Problema científico</w:t>
-      </w:r>
-    </w:p>
-    <w:p>
-      <w:pPr>
-        <w:pStyle w:val="BlockText"/>
-      </w:pPr>
-      <w:r>
-        <w:rPr>
-          <w:b/>
-          <w:bCs/>
-        </w:rPr>
-        <w:t xml:space="preserve">¿Qué patrones temporales, estacionales y espaciales presenta la anomalía de</w:t>
-      </w:r>
-      <w:r>
-        <w:rPr>
-          <w:b/>
-          <w:bCs/>
-        </w:rPr>
-        <w:t xml:space="preserve"> </w:t>
-      </w:r>
-      <w:r>
-        <w:rPr>
-          <w:b/>
-          <w:bCs/>
-        </w:rPr>
-        <w:t xml:space="preserve">almacenamiento total de agua (TWS) en el conjunto de datos del reto, y qué</w:t>
-      </w:r>
-      <w:r>
-        <w:rPr>
-          <w:b/>
-          <w:bCs/>
-        </w:rPr>
-        <w:t xml:space="preserve"> </w:t>
-      </w:r>
-      <w:r>
-        <w:rPr>
-          <w:b/>
-          <w:bCs/>
-        </w:rPr>
-        <w:t xml:space="preserve">variables satelitales y climáticas disponibles en el mes actual muestran mayor</w:t>
-      </w:r>
-      <w:r>
-        <w:rPr>
-          <w:b/>
-          <w:bCs/>
-        </w:rPr>
-        <w:t xml:space="preserve"> </w:t>
-      </w:r>
-      <w:r>
-        <w:rPr>
-          <w:b/>
-          <w:bCs/>
-        </w:rPr>
-        <w:t xml:space="preserve">asociación con el TWS del mes siguiente, de manera que puedan sustentar la</w:t>
-      </w:r>
-      <w:r>
-        <w:rPr>
-          <w:b/>
-          <w:bCs/>
-        </w:rPr>
-        <w:t xml:space="preserve"> </w:t>
-      </w:r>
-      <w:r>
-        <w:rPr>
-          <w:b/>
-          <w:bCs/>
-        </w:rPr>
-        <w:t xml:space="preserve">construcción de un modelo de pronóstico a un mes de horizonte?</w:t>
-      </w:r>
-    </w:p>
-    <w:p>
-      <w:pPr>
-        <w:pStyle w:val="FirstParagraph"/>
-      </w:pPr>
-      <w:r>
-        <w:t xml:space="preserve">Se trata de una pregunta descriptiva y asociativa, no causal.</w:t>
-      </w:r>
-    </w:p>
-    <w:bookmarkEnd w:id="11"/>
-    <w:bookmarkStart w:id="14" w:name="objetivos"/>
-    <w:p>
-      <w:pPr>
-        <w:pStyle w:val="Heading1"/>
-      </w:pPr>
-      <w:r>
-        <w:t xml:space="preserve">4. Objetivos</w:t>
-      </w:r>
-    </w:p>
-    <w:bookmarkStart w:id="12" w:name="objetivo-general"/>
+        <w:rPr>
+          <w:b/>
+          <w:bCs/>
+        </w:rPr>
+        <w:t xml:space="preserve">Repositorio:</w:t>
+      </w:r>
+      <w:r>
+        <w:t xml:space="preserve"> </w:t>
+      </w:r>
+      <w:hyperlink r:id="rId9">
+        <w:r>
+          <w:rPr>
+            <w:rStyle w:val="Hyperlink"/>
+          </w:rPr>
+          <w:t xml:space="preserve">https://github.com/Javiervalladares1/CC3084-Proyecto2-Drought-EDA</w:t>
+        </w:r>
+      </w:hyperlink>
+    </w:p>
+    <w:p>
+      <w:r>
+        <w:br w:type="page"/>
+      </w:r>
+    </w:p>
+    <w:bookmarkStart w:id="10" w:name="contenido"/>
     <w:p>
       <w:pPr>
         <w:pStyle w:val="Heading2"/>
       </w:pPr>
       <w:r>
-        <w:t xml:space="preserve">4.1 Objetivo general</w:t>
-      </w:r>
-    </w:p>
-    <w:p>
-      <w:pPr>
-        <w:pStyle w:val="FirstParagraph"/>
-      </w:pPr>
-      <w:r>
-        <w:t xml:space="preserve">Caracterizar, mediante un análisis exploratorio reproducible, el comportamiento</w:t>
-      </w:r>
-      <w:r>
-        <w:t xml:space="preserve"> </w:t>
-      </w:r>
-      <w:r>
-        <w:t xml:space="preserve">temporal, estacional y espacial de la anomalía de almacenamiento total de agua</w:t>
-      </w:r>
-      <w:r>
-        <w:t xml:space="preserve"> </w:t>
-      </w:r>
-      <w:r>
-        <w:t xml:space="preserve">(TWS) y de sus covariables en el conjunto de datos del reto, con el fin de</w:t>
-      </w:r>
-      <w:r>
-        <w:t xml:space="preserve"> </w:t>
-      </w:r>
-      <w:r>
-        <w:t xml:space="preserve">identificar los patrones y las variables que sustenten la construcción posterior</w:t>
-      </w:r>
-      <w:r>
-        <w:t xml:space="preserve"> </w:t>
-      </w:r>
-      <w:r>
-        <w:t xml:space="preserve">de un modelo de pronóstico a un mes de horizonte.</w:t>
-      </w:r>
-    </w:p>
-    <w:bookmarkEnd w:id="12"/>
-    <w:bookmarkStart w:id="13" w:name="objetivos-específicos"/>
-    <w:p>
-      <w:pPr>
-        <w:pStyle w:val="Heading2"/>
-      </w:pPr>
-      <w:r>
-        <w:t xml:space="preserve">4.2 Objetivos específicos</w:t>
+        <w:t xml:space="preserve">Contenido</w:t>
       </w:r>
     </w:p>
     <w:p>
@@ -604,23 +255,7 @@
         </w:numPr>
       </w:pPr>
       <w:r>
-        <w:rPr>
-          <w:b/>
-          <w:bCs/>
-        </w:rPr>
-        <w:t xml:space="preserve">Describir</w:t>
-      </w:r>
-      <w:r>
-        <w:t xml:space="preserve"> </w:t>
-      </w:r>
-      <w:r>
-        <w:t xml:space="preserve">la estructura del conjunto de datos: observaciones, variables,</w:t>
-      </w:r>
-      <w:r>
-        <w:t xml:space="preserve"> </w:t>
-      </w:r>
-      <w:r>
-        <w:t xml:space="preserve">tipos, y cobertura temporal y espacial.</w:t>
+        <w:t xml:space="preserve">Introducción</w:t>
       </w:r>
     </w:p>
     <w:p>
@@ -632,29 +267,7 @@
         </w:numPr>
       </w:pPr>
       <w:r>
-        <w:rPr>
-          <w:b/>
-          <w:bCs/>
-        </w:rPr>
-        <w:t xml:space="preserve">Evaluar</w:t>
-      </w:r>
-      <w:r>
-        <w:t xml:space="preserve"> </w:t>
-      </w:r>
-      <w:r>
-        <w:t xml:space="preserve">la calidad de los datos cuantificando valores faltantes,</w:t>
-      </w:r>
-      <w:r>
-        <w:t xml:space="preserve"> </w:t>
-      </w:r>
-      <w:r>
-        <w:t xml:space="preserve">duplicados y valores extremos, determinando si responden a patrones</w:t>
-      </w:r>
-      <w:r>
-        <w:t xml:space="preserve"> </w:t>
-      </w:r>
-      <w:r>
-        <w:t xml:space="preserve">temporales o espaciales antes de decidir su tratamiento.</w:t>
+        <w:t xml:space="preserve">Situación problemática</w:t>
       </w:r>
     </w:p>
     <w:p>
@@ -666,23 +279,7 @@
         </w:numPr>
       </w:pPr>
       <w:r>
-        <w:rPr>
-          <w:b/>
-          <w:bCs/>
-        </w:rPr>
-        <w:t xml:space="preserve">Analizar</w:t>
-      </w:r>
-      <w:r>
-        <w:t xml:space="preserve"> </w:t>
-      </w:r>
-      <w:r>
-        <w:t xml:space="preserve">el comportamiento temporal de la variable objetivo para</w:t>
-      </w:r>
-      <w:r>
-        <w:t xml:space="preserve"> </w:t>
-      </w:r>
-      <w:r>
-        <w:t xml:space="preserve">determinar la existencia de tendencia, estacionalidad y periodos anómalos.</w:t>
+        <w:t xml:space="preserve">Problema científico</w:t>
       </w:r>
     </w:p>
     <w:p>
@@ -694,23 +291,31 @@
         </w:numPr>
       </w:pPr>
       <w:r>
-        <w:rPr>
-          <w:b/>
-          <w:bCs/>
-        </w:rPr>
-        <w:t xml:space="preserve">Comparar</w:t>
-      </w:r>
-      <w:r>
-        <w:t xml:space="preserve"> </w:t>
-      </w:r>
-      <w:r>
-        <w:t xml:space="preserve">el comportamiento del almacenamiento entre ubicaciones</w:t>
-      </w:r>
-      <w:r>
-        <w:t xml:space="preserve"> </w:t>
-      </w:r>
-      <w:r>
-        <w:t xml:space="preserve">geográficas.</w:t>
+        <w:t xml:space="preserve">Objetivos</w:t>
+      </w:r>
+    </w:p>
+    <w:p>
+      <w:pPr>
+        <w:pStyle w:val="Compact"/>
+        <w:numPr>
+          <w:ilvl w:val="1"/>
+          <w:numId w:val="1002"/>
+        </w:numPr>
+      </w:pPr>
+      <w:r>
+        <w:t xml:space="preserve">4.1 Objetivo general</w:t>
+      </w:r>
+    </w:p>
+    <w:p>
+      <w:pPr>
+        <w:pStyle w:val="Compact"/>
+        <w:numPr>
+          <w:ilvl w:val="1"/>
+          <w:numId w:val="1002"/>
+        </w:numPr>
+      </w:pPr>
+      <w:r>
+        <w:t xml:space="preserve">4.2 Objetivos específicos</w:t>
       </w:r>
     </w:p>
     <w:p>
@@ -722,23 +327,31 @@
         </w:numPr>
       </w:pPr>
       <w:r>
-        <w:rPr>
-          <w:b/>
-          <w:bCs/>
-        </w:rPr>
-        <w:t xml:space="preserve">Determinar</w:t>
-      </w:r>
-      <w:r>
-        <w:t xml:space="preserve"> </w:t>
-      </w:r>
-      <w:r>
-        <w:t xml:space="preserve">el grado de asociación entre la variable objetivo, el</w:t>
-      </w:r>
-      <w:r>
-        <w:t xml:space="preserve"> </w:t>
-      </w:r>
-      <w:r>
-        <w:t xml:space="preserve">almacenamiento del mes actual y las covariables climáticas.</w:t>
+        <w:t xml:space="preserve">Contexto e investigación previa</w:t>
+      </w:r>
+    </w:p>
+    <w:p>
+      <w:pPr>
+        <w:pStyle w:val="Compact"/>
+        <w:numPr>
+          <w:ilvl w:val="1"/>
+          <w:numId w:val="1003"/>
+        </w:numPr>
+      </w:pPr>
+      <w:r>
+        <w:t xml:space="preserve">5.1 Qué es el Total Water Storage</w:t>
+      </w:r>
+    </w:p>
+    <w:p>
+      <w:pPr>
+        <w:pStyle w:val="Compact"/>
+        <w:numPr>
+          <w:ilvl w:val="1"/>
+          <w:numId w:val="1003"/>
+        </w:numPr>
+      </w:pPr>
+      <w:r>
+        <w:t xml:space="preserve">5.2 El SPEI</w:t>
       </w:r>
     </w:p>
     <w:p>
@@ -750,43 +363,202 @@
         </w:numPr>
       </w:pPr>
       <w:r>
-        <w:rPr>
-          <w:b/>
-          <w:bCs/>
-        </w:rPr>
-        <w:t xml:space="preserve">Identificar</w:t>
-      </w:r>
-      <w:r>
-        <w:t xml:space="preserve"> </w:t>
-      </w:r>
-      <w:r>
-        <w:t xml:space="preserve">las variables y transformaciones candidatas para la etapa</w:t>
-      </w:r>
-      <w:r>
-        <w:t xml:space="preserve"> </w:t>
-      </w:r>
-      <w:r>
-        <w:t xml:space="preserve">posterior de modelado.</w:t>
-      </w:r>
-    </w:p>
-    <w:bookmarkEnd w:id="13"/>
-    <w:bookmarkEnd w:id="14"/>
-    <w:bookmarkStart w:id="17" w:name="contexto-e-investigación-previa"/>
+        <w:t xml:space="preserve">Descripción de los datos</w:t>
+      </w:r>
+    </w:p>
+    <w:p>
+      <w:pPr>
+        <w:pStyle w:val="Compact"/>
+        <w:numPr>
+          <w:ilvl w:val="1"/>
+          <w:numId w:val="1004"/>
+        </w:numPr>
+      </w:pPr>
+      <w:r>
+        <w:t xml:space="preserve">6.1 Variables</w:t>
+      </w:r>
+    </w:p>
+    <w:p>
+      <w:pPr>
+        <w:pStyle w:val="Compact"/>
+        <w:numPr>
+          <w:ilvl w:val="1"/>
+          <w:numId w:val="1004"/>
+        </w:numPr>
+      </w:pPr>
+      <w:r>
+        <w:t xml:space="preserve">6.2 Verificación de la variable objetivo</w:t>
+      </w:r>
+    </w:p>
+    <w:p>
+      <w:pPr>
+        <w:pStyle w:val="Compact"/>
+        <w:numPr>
+          <w:ilvl w:val="0"/>
+          <w:numId w:val="1001"/>
+        </w:numPr>
+      </w:pPr>
+      <w:r>
+        <w:t xml:space="preserve">Limpieza y preprocesamiento</w:t>
+      </w:r>
+    </w:p>
+    <w:p>
+      <w:pPr>
+        <w:pStyle w:val="Compact"/>
+        <w:numPr>
+          <w:ilvl w:val="0"/>
+          <w:numId w:val="1001"/>
+        </w:numPr>
+      </w:pPr>
+      <w:r>
+        <w:t xml:space="preserve">Análisis exploratorio</w:t>
+      </w:r>
+    </w:p>
+    <w:p>
+      <w:pPr>
+        <w:pStyle w:val="Compact"/>
+        <w:numPr>
+          <w:ilvl w:val="1"/>
+          <w:numId w:val="1005"/>
+        </w:numPr>
+      </w:pPr>
+      <w:r>
+        <w:t xml:space="preserve">8.1 Los faltantes están en el calendario, no en las celdas</w:t>
+      </w:r>
+    </w:p>
+    <w:p>
+      <w:pPr>
+        <w:pStyle w:val="Compact"/>
+        <w:numPr>
+          <w:ilvl w:val="1"/>
+          <w:numId w:val="1005"/>
+        </w:numPr>
+      </w:pPr>
+      <w:r>
+        <w:t xml:space="preserve">8.2 Distribuciones y estadística descriptiva</w:t>
+      </w:r>
+    </w:p>
+    <w:p>
+      <w:pPr>
+        <w:pStyle w:val="Compact"/>
+        <w:numPr>
+          <w:ilvl w:val="1"/>
+          <w:numId w:val="1005"/>
+        </w:numPr>
+      </w:pPr>
+      <w:r>
+        <w:t xml:space="preserve">8.3 Valores atípicos</w:t>
+      </w:r>
+    </w:p>
+    <w:p>
+      <w:pPr>
+        <w:pStyle w:val="Compact"/>
+        <w:numPr>
+          <w:ilvl w:val="1"/>
+          <w:numId w:val="1005"/>
+        </w:numPr>
+      </w:pPr>
+      <w:r>
+        <w:t xml:space="preserve">8.4 Comportamiento temporal y estacionalidad</w:t>
+      </w:r>
+    </w:p>
+    <w:p>
+      <w:pPr>
+        <w:pStyle w:val="Compact"/>
+        <w:numPr>
+          <w:ilvl w:val="1"/>
+          <w:numId w:val="1005"/>
+        </w:numPr>
+      </w:pPr>
+      <w:r>
+        <w:t xml:space="preserve">8.5 Análisis espacial</w:t>
+      </w:r>
+    </w:p>
+    <w:p>
+      <w:pPr>
+        <w:pStyle w:val="Compact"/>
+        <w:numPr>
+          <w:ilvl w:val="1"/>
+          <w:numId w:val="1005"/>
+        </w:numPr>
+      </w:pPr>
+      <w:r>
+        <w:t xml:space="preserve">8.6 Correlaciones</w:t>
+      </w:r>
+    </w:p>
+    <w:p>
+      <w:pPr>
+        <w:pStyle w:val="Compact"/>
+        <w:numPr>
+          <w:ilvl w:val="1"/>
+          <w:numId w:val="1005"/>
+        </w:numPr>
+      </w:pPr>
+      <w:r>
+        <w:t xml:space="preserve">8.7 Categorías de sequía</w:t>
+      </w:r>
+    </w:p>
+    <w:p>
+      <w:pPr>
+        <w:pStyle w:val="Compact"/>
+        <w:numPr>
+          <w:ilvl w:val="0"/>
+          <w:numId w:val="1001"/>
+        </w:numPr>
+      </w:pPr>
+      <w:r>
+        <w:t xml:space="preserve">Hallazgos</w:t>
+      </w:r>
+    </w:p>
+    <w:p>
+      <w:pPr>
+        <w:pStyle w:val="Compact"/>
+        <w:numPr>
+          <w:ilvl w:val="0"/>
+          <w:numId w:val="1001"/>
+        </w:numPr>
+      </w:pPr>
+      <w:r>
+        <w:t xml:space="preserve">Conclusiones</w:t>
+      </w:r>
+    </w:p>
+    <w:p>
+      <w:pPr>
+        <w:pStyle w:val="Compact"/>
+        <w:numPr>
+          <w:ilvl w:val="0"/>
+          <w:numId w:val="1001"/>
+        </w:numPr>
+      </w:pPr>
+      <w:r>
+        <w:t xml:space="preserve">Próximos pasos</w:t>
+      </w:r>
+    </w:p>
+    <w:p>
+      <w:pPr>
+        <w:pStyle w:val="Compact"/>
+        <w:numPr>
+          <w:ilvl w:val="0"/>
+          <w:numId w:val="1001"/>
+        </w:numPr>
+      </w:pPr>
+      <w:r>
+        <w:t xml:space="preserve">Referencias</w:t>
+      </w:r>
+    </w:p>
+    <w:p>
+      <w:r>
+        <w:br w:type="page"/>
+      </w:r>
+    </w:p>
+    <w:bookmarkEnd w:id="10"/>
+    <w:bookmarkStart w:id="11" w:name="introducción"/>
     <w:p>
       <w:pPr>
         <w:pStyle w:val="Heading1"/>
       </w:pPr>
       <w:r>
-        <w:t xml:space="preserve">5. Contexto e investigación previa</w:t>
-      </w:r>
-    </w:p>
-    <w:bookmarkStart w:id="15" w:name="qué-es-el-total-water-storage"/>
-    <w:p>
-      <w:pPr>
-        <w:pStyle w:val="Heading2"/>
-      </w:pPr>
-      <w:r>
-        <w:t xml:space="preserve">5.1 Qué es el Total Water Storage</w:t>
+        <w:t xml:space="preserve">1. Introducción</w:t>
       </w:r>
     </w:p>
     <w:p>
@@ -794,110 +566,7 @@
         <w:pStyle w:val="FirstParagraph"/>
       </w:pPr>
       <w:r>
-        <w:t xml:space="preserve">El</w:t>
-      </w:r>
-      <w:r>
-        <w:t xml:space="preserve"> </w:t>
-      </w:r>
-      <w:r>
-        <w:rPr>
-          <w:b/>
-          <w:bCs/>
-        </w:rPr>
-        <w:t xml:space="preserve">TWS</w:t>
-      </w:r>
-      <w:r>
-        <w:t xml:space="preserve"> </w:t>
-      </w:r>
-      <w:r>
-        <w:t xml:space="preserve">se define en la documentación del reto como todo el agua almacenada</w:t>
-      </w:r>
-      <w:r>
-        <w:t xml:space="preserve"> </w:t>
-      </w:r>
-      <w:r>
-        <w:t xml:space="preserve">sobre y bajo la superficie terrestre: agua subterránea, humedad del suelo, agua</w:t>
-      </w:r>
-      <w:r>
-        <w:t xml:space="preserve"> </w:t>
-      </w:r>
-      <w:r>
-        <w:t xml:space="preserve">superficial, nieve y hielo. Se expresa como</w:t>
-      </w:r>
-      <w:r>
-        <w:t xml:space="preserve"> </w:t>
-      </w:r>
-      <w:r>
-        <w:rPr>
-          <w:b/>
-          <w:bCs/>
-        </w:rPr>
-        <w:t xml:space="preserve">anomalía</w:t>
-      </w:r>
-      <w:r>
-        <w:t xml:space="preserve">, es decir, como</w:t>
-      </w:r>
-      <w:r>
-        <w:t xml:space="preserve"> </w:t>
-      </w:r>
-      <w:r>
-        <w:t xml:space="preserve">desviación respecto a una línea base histórica.</w:t>
-      </w:r>
-    </w:p>
-    <w:p>
-      <w:pPr>
-        <w:pStyle w:val="BodyText"/>
-      </w:pPr>
-      <w:r>
-        <w:t xml:space="preserve">Las misiones GRACE y GRACE-FO no observan el agua directamente: miden variaciones</w:t>
-      </w:r>
-      <w:r>
-        <w:t xml:space="preserve"> </w:t>
-      </w:r>
-      <w:r>
-        <w:t xml:space="preserve">del campo gravitatorio terrestre. Como el agua tiene masa, un cambio en el</w:t>
-      </w:r>
-      <w:r>
-        <w:t xml:space="preserve"> </w:t>
-      </w:r>
-      <w:r>
-        <w:t xml:space="preserve">almacenamiento de una región modifica localmente la gravedad. De ahí se derivan</w:t>
-      </w:r>
-      <w:r>
-        <w:t xml:space="preserve"> </w:t>
-      </w:r>
-      <w:r>
-        <w:t xml:space="preserve">tres características que condicionan el análisis: resolución espacial del orden</w:t>
-      </w:r>
-      <w:r>
-        <w:t xml:space="preserve"> </w:t>
-      </w:r>
-      <w:r>
-        <w:t xml:space="preserve">de cientos de kilómetros, resolución temporal mensual, y una medida integrada en</w:t>
-      </w:r>
-      <w:r>
-        <w:t xml:space="preserve"> </w:t>
-      </w:r>
-      <w:r>
-        <w:t xml:space="preserve">profundidad que responde con más inercia que la lluvia.</w:t>
-      </w:r>
-    </w:p>
-    <w:bookmarkEnd w:id="15"/>
-    <w:bookmarkStart w:id="16" w:name="el-spei"/>
-    <w:p>
-      <w:pPr>
-        <w:pStyle w:val="Heading2"/>
-      </w:pPr>
-      <w:r>
-        <w:t xml:space="preserve">5.2 El SPEI</w:t>
-      </w:r>
-    </w:p>
-    <w:p>
-      <w:pPr>
-        <w:pStyle w:val="FirstParagraph"/>
-      </w:pPr>
-      <w:r>
-        <w:t xml:space="preserve">El</w:t>
+        <w:t xml:space="preserve">Este informe presenta el análisis exploratorio de datos del reto</w:t>
       </w:r>
       <w:r>
         <w:t xml:space="preserve"> </w:t>
@@ -907,6 +576,842 @@
           <w:i/>
           <w:iCs/>
         </w:rPr>
+        <w:t xml:space="preserve">A Step Ahead of</w:t>
+      </w:r>
+      <w:r>
+        <w:rPr>
+          <w:i/>
+          <w:iCs/>
+        </w:rPr>
+        <w:t xml:space="preserve"> </w:t>
+      </w:r>
+      <w:r>
+        <w:rPr>
+          <w:i/>
+          <w:iCs/>
+        </w:rPr>
+        <w:t xml:space="preserve">Drought: Forecasting Global Water Storage Challenge</w:t>
+      </w:r>
+      <w:r>
+        <w:t xml:space="preserve">, organizado por la</w:t>
+      </w:r>
+      <w:r>
+        <w:t xml:space="preserve"> </w:t>
+      </w:r>
+      <w:r>
+        <w:t xml:space="preserve">International Telecommunication Union (ITU) junto con agencias del Sistema de</w:t>
+      </w:r>
+      <w:r>
+        <w:t xml:space="preserve"> </w:t>
+      </w:r>
+      <w:r>
+        <w:t xml:space="preserve">Naciones Unidas y alojado en la plataforma Zindi. El reto pertenece a la</w:t>
+      </w:r>
+      <w:r>
+        <w:t xml:space="preserve"> </w:t>
+      </w:r>
+      <w:r>
+        <w:t xml:space="preserve">categoría de</w:t>
+      </w:r>
+      <w:r>
+        <w:t xml:space="preserve"> </w:t>
+      </w:r>
+      <w:r>
+        <w:rPr>
+          <w:b/>
+          <w:bCs/>
+        </w:rPr>
+        <w:t xml:space="preserve">series de tiempo con datos satelitales</w:t>
+      </w:r>
+      <w:r>
+        <w:t xml:space="preserve">.</w:t>
+      </w:r>
+    </w:p>
+    <w:p>
+      <w:pPr>
+        <w:pStyle w:val="BodyText"/>
+      </w:pPr>
+      <w:r>
+        <w:t xml:space="preserve">El objetivo de esta etapa no es construir el modelo de pronóstico, sino</w:t>
+      </w:r>
+      <w:r>
+        <w:t xml:space="preserve"> </w:t>
+      </w:r>
+      <w:r>
+        <w:t xml:space="preserve">comprender el fenómeno estudiado, la estructura del conjunto de datos y los</w:t>
+      </w:r>
+      <w:r>
+        <w:t xml:space="preserve"> </w:t>
+      </w:r>
+      <w:r>
+        <w:t xml:space="preserve">patrones que permitirán, en una fase posterior, plantear un modelo con criterio.</w:t>
+      </w:r>
+    </w:p>
+    <w:p>
+      <w:pPr>
+        <w:pStyle w:val="BodyText"/>
+      </w:pPr>
+      <w:r>
+        <w:t xml:space="preserve">Todo el análisis es reproducible: el cuaderno</w:t>
+      </w:r>
+      <w:r>
+        <w:t xml:space="preserve"> </w:t>
+      </w:r>
+      <w:r>
+        <w:rPr>
+          <w:rStyle w:val="VerbatimChar"/>
+        </w:rPr>
+        <w:t xml:space="preserve">Proyecto2_Analisis_Exploratorio.ipynb</w:t>
+      </w:r>
+      <w:r>
+        <w:t xml:space="preserve"> </w:t>
+      </w:r>
+      <w:r>
+        <w:t xml:space="preserve">se ejecuta de principio a fin sin errores y genera las tablas y figuras que aquí</w:t>
+      </w:r>
+      <w:r>
+        <w:t xml:space="preserve"> </w:t>
+      </w:r>
+      <w:r>
+        <w:t xml:space="preserve">se citan. El código, el notebook ejecutado y los entregables están versionados en:</w:t>
+      </w:r>
+    </w:p>
+    <w:p>
+      <w:pPr>
+        <w:pStyle w:val="BlockText"/>
+      </w:pPr>
+      <w:hyperlink r:id="rId9">
+        <w:r>
+          <w:rPr>
+            <w:rStyle w:val="Hyperlink"/>
+            <w:b/>
+            <w:bCs/>
+          </w:rPr>
+          <w:t xml:space="preserve">https://github.com/Javiervalladares1/CC3084-Proyecto2-Drought-EDA</w:t>
+        </w:r>
+      </w:hyperlink>
+    </w:p>
+    <w:p>
+      <w:pPr>
+        <w:pStyle w:val="FirstParagraph"/>
+      </w:pPr>
+      <w:r>
+        <w:t xml:space="preserve">A lo largo del documento se distingue explícitamente entre lo que se observa en</w:t>
+      </w:r>
+      <w:r>
+        <w:t xml:space="preserve"> </w:t>
+      </w:r>
+      <w:r>
+        <w:t xml:space="preserve">los datos y la información tomada de fuentes externas.</w:t>
+      </w:r>
+    </w:p>
+    <w:bookmarkEnd w:id="11"/>
+    <w:bookmarkStart w:id="12" w:name="situación-problemática"/>
+    <w:p>
+      <w:pPr>
+        <w:pStyle w:val="Heading1"/>
+      </w:pPr>
+      <w:r>
+        <w:t xml:space="preserve">2. Situación problemática</w:t>
+      </w:r>
+    </w:p>
+    <w:p>
+      <w:pPr>
+        <w:pStyle w:val="FirstParagraph"/>
+      </w:pPr>
+      <w:r>
+        <w:t xml:space="preserve">El agua dulce disponible no está distribuida de manera uniforme ni es constante</w:t>
+      </w:r>
+      <w:r>
+        <w:t xml:space="preserve"> </w:t>
+      </w:r>
+      <w:r>
+        <w:t xml:space="preserve">en el tiempo. Su disponibilidad depende del balance entre la precipitación</w:t>
+      </w:r>
+      <w:r>
+        <w:t xml:space="preserve"> </w:t>
+      </w:r>
+      <w:r>
+        <w:t xml:space="preserve">recibida y las pérdidas por evapotranspiración y escorrentía, y ese balance se</w:t>
+      </w:r>
+      <w:r>
+        <w:t xml:space="preserve"> </w:t>
+      </w:r>
+      <w:r>
+        <w:t xml:space="preserve">acumula durante meses o años en el suelo, en los cuerpos de agua superficiales y</w:t>
+      </w:r>
+      <w:r>
+        <w:t xml:space="preserve"> </w:t>
+      </w:r>
+      <w:r>
+        <w:t xml:space="preserve">en los acuíferos. Cuando permanece negativo de forma prolongada aparece la</w:t>
+      </w:r>
+      <w:r>
+        <w:t xml:space="preserve"> </w:t>
+      </w:r>
+      <w:r>
+        <w:rPr>
+          <w:b/>
+          <w:bCs/>
+        </w:rPr>
+        <w:t xml:space="preserve">sequía hidrológica</w:t>
+      </w:r>
+      <w:r>
+        <w:t xml:space="preserve">: una reducción sostenida del agua efectivamente almacenada</w:t>
+      </w:r>
+      <w:r>
+        <w:t xml:space="preserve"> </w:t>
+      </w:r>
+      <w:r>
+        <w:t xml:space="preserve">en un territorio.</w:t>
+      </w:r>
+    </w:p>
+    <w:p>
+      <w:pPr>
+        <w:pStyle w:val="BodyText"/>
+      </w:pPr>
+      <w:r>
+        <w:t xml:space="preserve">El problema práctico es que esa reducción no se observa con facilidad. La lluvia</w:t>
+      </w:r>
+      <w:r>
+        <w:t xml:space="preserve"> </w:t>
+      </w:r>
+      <w:r>
+        <w:t xml:space="preserve">se mide bien, pero no describe por sí sola el estado del sistema: una región</w:t>
+      </w:r>
+      <w:r>
+        <w:t xml:space="preserve"> </w:t>
+      </w:r>
+      <w:r>
+        <w:t xml:space="preserve">puede recibir precipitación normal y seguir agotándose si la demanda evaporativa</w:t>
+      </w:r>
+      <w:r>
+        <w:t xml:space="preserve"> </w:t>
+      </w:r>
+      <w:r>
+        <w:t xml:space="preserve">es alta o si la extracción de agua subterránea excede la recarga. Medir</w:t>
+      </w:r>
+      <w:r>
+        <w:t xml:space="preserve"> </w:t>
+      </w:r>
+      <w:r>
+        <w:t xml:space="preserve">directamente el agua almacenada exigiría una red de observación que a escala</w:t>
+      </w:r>
+      <w:r>
+        <w:t xml:space="preserve"> </w:t>
+      </w:r>
+      <w:r>
+        <w:t xml:space="preserve">global no existe con cobertura suficiente.</w:t>
+      </w:r>
+    </w:p>
+    <w:p>
+      <w:pPr>
+        <w:pStyle w:val="BodyText"/>
+      </w:pPr>
+      <w:r>
+        <w:t xml:space="preserve">Los datos satelitales cambian ese planteamiento. Las misiones</w:t>
+      </w:r>
+      <w:r>
+        <w:t xml:space="preserve"> </w:t>
+      </w:r>
+      <w:r>
+        <w:rPr>
+          <w:b/>
+          <w:bCs/>
+        </w:rPr>
+        <w:t xml:space="preserve">GRACE</w:t>
+      </w:r>
+      <w:r>
+        <w:t xml:space="preserve"> </w:t>
+      </w:r>
+      <w:r>
+        <w:t xml:space="preserve">(2002–2017)</w:t>
+      </w:r>
+      <w:r>
+        <w:t xml:space="preserve"> </w:t>
+      </w:r>
+      <w:r>
+        <w:t xml:space="preserve">y</w:t>
+      </w:r>
+      <w:r>
+        <w:t xml:space="preserve"> </w:t>
+      </w:r>
+      <w:r>
+        <w:rPr>
+          <w:b/>
+          <w:bCs/>
+        </w:rPr>
+        <w:t xml:space="preserve">GRACE-FO</w:t>
+      </w:r>
+      <w:r>
+        <w:t xml:space="preserve"> </w:t>
+      </w:r>
+      <w:r>
+        <w:t xml:space="preserve">(desde 2018) estiman el almacenamiento total de agua de forma</w:t>
+      </w:r>
+      <w:r>
+        <w:t xml:space="preserve"> </w:t>
+      </w:r>
+      <w:r>
+        <w:t xml:space="preserve">indirecta, midiendo variaciones del campo gravitatorio terrestre. Proporcionan</w:t>
+      </w:r>
+      <w:r>
+        <w:t xml:space="preserve"> </w:t>
+      </w:r>
+      <w:r>
+        <w:t xml:space="preserve">una variable comparable entre regiones que integra agua superficial y subterránea.</w:t>
+      </w:r>
+    </w:p>
+    <w:p>
+      <w:pPr>
+        <w:pStyle w:val="BodyText"/>
+      </w:pPr>
+      <w:r>
+        <w:t xml:space="preserve">Sin embargo, esta solución trae una limitación operativa. Según la descripción</w:t>
+      </w:r>
+      <w:r>
+        <w:t xml:space="preserve"> </w:t>
+      </w:r>
+      <w:r>
+        <w:t xml:space="preserve">oficial del reto, los productos derivados de GRACE se publican con un</w:t>
+      </w:r>
+      <w:r>
+        <w:t xml:space="preserve"> </w:t>
+      </w:r>
+      <w:r>
+        <w:rPr>
+          <w:b/>
+          <w:bCs/>
+        </w:rPr>
+        <w:t xml:space="preserve">retraso de</w:t>
+      </w:r>
+      <w:r>
+        <w:rPr>
+          <w:b/>
+          <w:bCs/>
+        </w:rPr>
+        <w:t xml:space="preserve"> </w:t>
+      </w:r>
+      <w:r>
+        <w:rPr>
+          <w:b/>
+          <w:bCs/>
+        </w:rPr>
+        <w:t xml:space="preserve">aproximadamente 2 a 3 meses</w:t>
+      </w:r>
+      <w:r>
+        <w:t xml:space="preserve">. Para monitoreo y alerta temprana se necesita</w:t>
+      </w:r>
+      <w:r>
+        <w:t xml:space="preserve"> </w:t>
+      </w:r>
+      <w:r>
+        <w:t xml:space="preserve">conocer el estado actual del sistema, y lo disponible es el estado de hace un</w:t>
+      </w:r>
+      <w:r>
+        <w:t xml:space="preserve"> </w:t>
+      </w:r>
+      <w:r>
+        <w:t xml:space="preserve">trimestre: la información existe, pero llega tarde para sostener una decisión.</w:t>
+      </w:r>
+    </w:p>
+    <w:p>
+      <w:pPr>
+        <w:pStyle w:val="BodyText"/>
+      </w:pPr>
+      <w:r>
+        <w:t xml:space="preserve">Anticipar el almacenamiento futuro no es trivial. El comportamiento del agua</w:t>
+      </w:r>
+      <w:r>
+        <w:t xml:space="preserve"> </w:t>
+      </w:r>
+      <w:r>
+        <w:t xml:space="preserve">almacenada no es homogéneo en el espacio; la señal combina tendencia,</w:t>
+      </w:r>
+      <w:r>
+        <w:t xml:space="preserve"> </w:t>
+      </w:r>
+      <w:r>
+        <w:t xml:space="preserve">estacionalidad y variabilidad interanual; las covariables de baja latencia</w:t>
+      </w:r>
+      <w:r>
+        <w:t xml:space="preserve"> </w:t>
+      </w:r>
+      <w:r>
+        <w:t xml:space="preserve">describen sobre todo la parte superficial del ciclo hidrológico, mientras el TWS</w:t>
+      </w:r>
+      <w:r>
+        <w:t xml:space="preserve"> </w:t>
+      </w:r>
+      <w:r>
+        <w:t xml:space="preserve">incluye componentes de respuesta lenta; y los registros satelitales presentan</w:t>
+      </w:r>
+      <w:r>
+        <w:t xml:space="preserve"> </w:t>
+      </w:r>
+      <w:r>
+        <w:t xml:space="preserve">interrupciones.</w:t>
+      </w:r>
+    </w:p>
+    <w:bookmarkEnd w:id="12"/>
+    <w:bookmarkStart w:id="13" w:name="problema-científico"/>
+    <w:p>
+      <w:pPr>
+        <w:pStyle w:val="Heading1"/>
+      </w:pPr>
+      <w:r>
+        <w:t xml:space="preserve">3. Problema científico</w:t>
+      </w:r>
+    </w:p>
+    <w:p>
+      <w:pPr>
+        <w:pStyle w:val="BlockText"/>
+      </w:pPr>
+      <w:r>
+        <w:rPr>
+          <w:b/>
+          <w:bCs/>
+        </w:rPr>
+        <w:t xml:space="preserve">¿Qué patrones temporales, estacionales y espaciales presenta la anomalía de</w:t>
+      </w:r>
+      <w:r>
+        <w:rPr>
+          <w:b/>
+          <w:bCs/>
+        </w:rPr>
+        <w:t xml:space="preserve"> </w:t>
+      </w:r>
+      <w:r>
+        <w:rPr>
+          <w:b/>
+          <w:bCs/>
+        </w:rPr>
+        <w:t xml:space="preserve">almacenamiento total de agua (TWS) en el conjunto de datos del reto, y qué</w:t>
+      </w:r>
+      <w:r>
+        <w:rPr>
+          <w:b/>
+          <w:bCs/>
+        </w:rPr>
+        <w:t xml:space="preserve"> </w:t>
+      </w:r>
+      <w:r>
+        <w:rPr>
+          <w:b/>
+          <w:bCs/>
+        </w:rPr>
+        <w:t xml:space="preserve">variables satelitales y climáticas disponibles en el mes actual muestran mayor</w:t>
+      </w:r>
+      <w:r>
+        <w:rPr>
+          <w:b/>
+          <w:bCs/>
+        </w:rPr>
+        <w:t xml:space="preserve"> </w:t>
+      </w:r>
+      <w:r>
+        <w:rPr>
+          <w:b/>
+          <w:bCs/>
+        </w:rPr>
+        <w:t xml:space="preserve">asociación con el TWS del mes siguiente, de manera que puedan sustentar la</w:t>
+      </w:r>
+      <w:r>
+        <w:rPr>
+          <w:b/>
+          <w:bCs/>
+        </w:rPr>
+        <w:t xml:space="preserve"> </w:t>
+      </w:r>
+      <w:r>
+        <w:rPr>
+          <w:b/>
+          <w:bCs/>
+        </w:rPr>
+        <w:t xml:space="preserve">construcción de un modelo de pronóstico a un mes de horizonte?</w:t>
+      </w:r>
+    </w:p>
+    <w:p>
+      <w:pPr>
+        <w:pStyle w:val="FirstParagraph"/>
+      </w:pPr>
+      <w:r>
+        <w:t xml:space="preserve">Se trata de una pregunta descriptiva y asociativa, no causal.</w:t>
+      </w:r>
+    </w:p>
+    <w:bookmarkEnd w:id="13"/>
+    <w:bookmarkStart w:id="16" w:name="objetivos"/>
+    <w:p>
+      <w:pPr>
+        <w:pStyle w:val="Heading1"/>
+      </w:pPr>
+      <w:r>
+        <w:t xml:space="preserve">4. Objetivos</w:t>
+      </w:r>
+    </w:p>
+    <w:bookmarkStart w:id="14" w:name="objetivo-general"/>
+    <w:p>
+      <w:pPr>
+        <w:pStyle w:val="Heading2"/>
+      </w:pPr>
+      <w:r>
+        <w:t xml:space="preserve">4.1 Objetivo general</w:t>
+      </w:r>
+    </w:p>
+    <w:p>
+      <w:pPr>
+        <w:pStyle w:val="FirstParagraph"/>
+      </w:pPr>
+      <w:r>
+        <w:t xml:space="preserve">Caracterizar, mediante un análisis exploratorio reproducible, el comportamiento</w:t>
+      </w:r>
+      <w:r>
+        <w:t xml:space="preserve"> </w:t>
+      </w:r>
+      <w:r>
+        <w:t xml:space="preserve">temporal, estacional y espacial de la anomalía de almacenamiento total de agua</w:t>
+      </w:r>
+      <w:r>
+        <w:t xml:space="preserve"> </w:t>
+      </w:r>
+      <w:r>
+        <w:t xml:space="preserve">(TWS) y de sus covariables en el conjunto de datos del reto, con el fin de</w:t>
+      </w:r>
+      <w:r>
+        <w:t xml:space="preserve"> </w:t>
+      </w:r>
+      <w:r>
+        <w:t xml:space="preserve">identificar los patrones y las variables que sustenten la construcción posterior</w:t>
+      </w:r>
+      <w:r>
+        <w:t xml:space="preserve"> </w:t>
+      </w:r>
+      <w:r>
+        <w:t xml:space="preserve">de un modelo de pronóstico a un mes de horizonte.</w:t>
+      </w:r>
+    </w:p>
+    <w:bookmarkEnd w:id="14"/>
+    <w:bookmarkStart w:id="15" w:name="objetivos-específicos"/>
+    <w:p>
+      <w:pPr>
+        <w:pStyle w:val="Heading2"/>
+      </w:pPr>
+      <w:r>
+        <w:t xml:space="preserve">4.2 Objetivos específicos</w:t>
+      </w:r>
+    </w:p>
+    <w:p>
+      <w:pPr>
+        <w:pStyle w:val="Compact"/>
+        <w:numPr>
+          <w:ilvl w:val="0"/>
+          <w:numId w:val="1006"/>
+        </w:numPr>
+      </w:pPr>
+      <w:r>
+        <w:rPr>
+          <w:b/>
+          <w:bCs/>
+        </w:rPr>
+        <w:t xml:space="preserve">Describir</w:t>
+      </w:r>
+      <w:r>
+        <w:t xml:space="preserve"> </w:t>
+      </w:r>
+      <w:r>
+        <w:t xml:space="preserve">la estructura del conjunto de datos: observaciones, variables,</w:t>
+      </w:r>
+      <w:r>
+        <w:t xml:space="preserve"> </w:t>
+      </w:r>
+      <w:r>
+        <w:t xml:space="preserve">tipos, y cobertura temporal y espacial.</w:t>
+      </w:r>
+    </w:p>
+    <w:p>
+      <w:pPr>
+        <w:pStyle w:val="Compact"/>
+        <w:numPr>
+          <w:ilvl w:val="0"/>
+          <w:numId w:val="1006"/>
+        </w:numPr>
+      </w:pPr>
+      <w:r>
+        <w:rPr>
+          <w:b/>
+          <w:bCs/>
+        </w:rPr>
+        <w:t xml:space="preserve">Evaluar</w:t>
+      </w:r>
+      <w:r>
+        <w:t xml:space="preserve"> </w:t>
+      </w:r>
+      <w:r>
+        <w:t xml:space="preserve">la calidad de los datos cuantificando valores faltantes,</w:t>
+      </w:r>
+      <w:r>
+        <w:t xml:space="preserve"> </w:t>
+      </w:r>
+      <w:r>
+        <w:t xml:space="preserve">duplicados y valores extremos, determinando si responden a patrones</w:t>
+      </w:r>
+      <w:r>
+        <w:t xml:space="preserve"> </w:t>
+      </w:r>
+      <w:r>
+        <w:t xml:space="preserve">temporales o espaciales antes de decidir su tratamiento.</w:t>
+      </w:r>
+    </w:p>
+    <w:p>
+      <w:pPr>
+        <w:pStyle w:val="Compact"/>
+        <w:numPr>
+          <w:ilvl w:val="0"/>
+          <w:numId w:val="1006"/>
+        </w:numPr>
+      </w:pPr>
+      <w:r>
+        <w:rPr>
+          <w:b/>
+          <w:bCs/>
+        </w:rPr>
+        <w:t xml:space="preserve">Analizar</w:t>
+      </w:r>
+      <w:r>
+        <w:t xml:space="preserve"> </w:t>
+      </w:r>
+      <w:r>
+        <w:t xml:space="preserve">el comportamiento temporal de la variable objetivo para</w:t>
+      </w:r>
+      <w:r>
+        <w:t xml:space="preserve"> </w:t>
+      </w:r>
+      <w:r>
+        <w:t xml:space="preserve">determinar la existencia de tendencia, estacionalidad y periodos anómalos.</w:t>
+      </w:r>
+    </w:p>
+    <w:p>
+      <w:pPr>
+        <w:pStyle w:val="Compact"/>
+        <w:numPr>
+          <w:ilvl w:val="0"/>
+          <w:numId w:val="1006"/>
+        </w:numPr>
+      </w:pPr>
+      <w:r>
+        <w:rPr>
+          <w:b/>
+          <w:bCs/>
+        </w:rPr>
+        <w:t xml:space="preserve">Comparar</w:t>
+      </w:r>
+      <w:r>
+        <w:t xml:space="preserve"> </w:t>
+      </w:r>
+      <w:r>
+        <w:t xml:space="preserve">el comportamiento del almacenamiento entre ubicaciones</w:t>
+      </w:r>
+      <w:r>
+        <w:t xml:space="preserve"> </w:t>
+      </w:r>
+      <w:r>
+        <w:t xml:space="preserve">geográficas.</w:t>
+      </w:r>
+    </w:p>
+    <w:p>
+      <w:pPr>
+        <w:pStyle w:val="Compact"/>
+        <w:numPr>
+          <w:ilvl w:val="0"/>
+          <w:numId w:val="1006"/>
+        </w:numPr>
+      </w:pPr>
+      <w:r>
+        <w:rPr>
+          <w:b/>
+          <w:bCs/>
+        </w:rPr>
+        <w:t xml:space="preserve">Determinar</w:t>
+      </w:r>
+      <w:r>
+        <w:t xml:space="preserve"> </w:t>
+      </w:r>
+      <w:r>
+        <w:t xml:space="preserve">el grado de asociación entre la variable objetivo, el</w:t>
+      </w:r>
+      <w:r>
+        <w:t xml:space="preserve"> </w:t>
+      </w:r>
+      <w:r>
+        <w:t xml:space="preserve">almacenamiento del mes actual y las covariables climáticas.</w:t>
+      </w:r>
+    </w:p>
+    <w:p>
+      <w:pPr>
+        <w:pStyle w:val="Compact"/>
+        <w:numPr>
+          <w:ilvl w:val="0"/>
+          <w:numId w:val="1006"/>
+        </w:numPr>
+      </w:pPr>
+      <w:r>
+        <w:rPr>
+          <w:b/>
+          <w:bCs/>
+        </w:rPr>
+        <w:t xml:space="preserve">Identificar</w:t>
+      </w:r>
+      <w:r>
+        <w:t xml:space="preserve"> </w:t>
+      </w:r>
+      <w:r>
+        <w:t xml:space="preserve">las variables y transformaciones candidatas para la etapa</w:t>
+      </w:r>
+      <w:r>
+        <w:t xml:space="preserve"> </w:t>
+      </w:r>
+      <w:r>
+        <w:t xml:space="preserve">posterior de modelado.</w:t>
+      </w:r>
+    </w:p>
+    <w:bookmarkEnd w:id="15"/>
+    <w:bookmarkEnd w:id="16"/>
+    <w:bookmarkStart w:id="19" w:name="contexto-e-investigación-previa"/>
+    <w:p>
+      <w:pPr>
+        <w:pStyle w:val="Heading1"/>
+      </w:pPr>
+      <w:r>
+        <w:t xml:space="preserve">5. Contexto e investigación previa</w:t>
+      </w:r>
+    </w:p>
+    <w:bookmarkStart w:id="17" w:name="qué-es-el-total-water-storage"/>
+    <w:p>
+      <w:pPr>
+        <w:pStyle w:val="Heading2"/>
+      </w:pPr>
+      <w:r>
+        <w:t xml:space="preserve">5.1 Qué es el Total Water Storage</w:t>
+      </w:r>
+    </w:p>
+    <w:p>
+      <w:pPr>
+        <w:pStyle w:val="FirstParagraph"/>
+      </w:pPr>
+      <w:r>
+        <w:t xml:space="preserve">El</w:t>
+      </w:r>
+      <w:r>
+        <w:t xml:space="preserve"> </w:t>
+      </w:r>
+      <w:r>
+        <w:rPr>
+          <w:b/>
+          <w:bCs/>
+        </w:rPr>
+        <w:t xml:space="preserve">TWS</w:t>
+      </w:r>
+      <w:r>
+        <w:t xml:space="preserve"> </w:t>
+      </w:r>
+      <w:r>
+        <w:t xml:space="preserve">se define en la documentación del reto como todo el agua almacenada</w:t>
+      </w:r>
+      <w:r>
+        <w:t xml:space="preserve"> </w:t>
+      </w:r>
+      <w:r>
+        <w:t xml:space="preserve">sobre y bajo la superficie terrestre: agua subterránea, humedad del suelo, agua</w:t>
+      </w:r>
+      <w:r>
+        <w:t xml:space="preserve"> </w:t>
+      </w:r>
+      <w:r>
+        <w:t xml:space="preserve">superficial, nieve y hielo. Se expresa como</w:t>
+      </w:r>
+      <w:r>
+        <w:t xml:space="preserve"> </w:t>
+      </w:r>
+      <w:r>
+        <w:rPr>
+          <w:b/>
+          <w:bCs/>
+        </w:rPr>
+        <w:t xml:space="preserve">anomalía</w:t>
+      </w:r>
+      <w:r>
+        <w:t xml:space="preserve">, es decir, como</w:t>
+      </w:r>
+      <w:r>
+        <w:t xml:space="preserve"> </w:t>
+      </w:r>
+      <w:r>
+        <w:t xml:space="preserve">desviación respecto a una línea base histórica.</w:t>
+      </w:r>
+    </w:p>
+    <w:p>
+      <w:pPr>
+        <w:pStyle w:val="BodyText"/>
+      </w:pPr>
+      <w:r>
+        <w:t xml:space="preserve">Las misiones GRACE y GRACE-FO no observan el agua directamente: miden variaciones</w:t>
+      </w:r>
+      <w:r>
+        <w:t xml:space="preserve"> </w:t>
+      </w:r>
+      <w:r>
+        <w:t xml:space="preserve">del campo gravitatorio terrestre. Como el agua tiene masa, un cambio en el</w:t>
+      </w:r>
+      <w:r>
+        <w:t xml:space="preserve"> </w:t>
+      </w:r>
+      <w:r>
+        <w:t xml:space="preserve">almacenamiento de una región modifica localmente la gravedad. De ahí se derivan</w:t>
+      </w:r>
+      <w:r>
+        <w:t xml:space="preserve"> </w:t>
+      </w:r>
+      <w:r>
+        <w:t xml:space="preserve">tres características que condicionan el análisis: resolución espacial del orden</w:t>
+      </w:r>
+      <w:r>
+        <w:t xml:space="preserve"> </w:t>
+      </w:r>
+      <w:r>
+        <w:t xml:space="preserve">de cientos de kilómetros, resolución temporal mensual, y una medida integrada en</w:t>
+      </w:r>
+      <w:r>
+        <w:t xml:space="preserve"> </w:t>
+      </w:r>
+      <w:r>
+        <w:t xml:space="preserve">profundidad que responde con más inercia que la lluvia.</w:t>
+      </w:r>
+    </w:p>
+    <w:bookmarkEnd w:id="17"/>
+    <w:bookmarkStart w:id="18" w:name="el-spei"/>
+    <w:p>
+      <w:pPr>
+        <w:pStyle w:val="Heading2"/>
+      </w:pPr>
+      <w:r>
+        <w:t xml:space="preserve">5.2 El SPEI</w:t>
+      </w:r>
+    </w:p>
+    <w:p>
+      <w:pPr>
+        <w:pStyle w:val="FirstParagraph"/>
+      </w:pPr>
+      <w:r>
+        <w:t xml:space="preserve">El</w:t>
+      </w:r>
+      <w:r>
+        <w:t xml:space="preserve"> </w:t>
+      </w:r>
+      <w:r>
+        <w:rPr>
+          <w:i/>
+          <w:iCs/>
+        </w:rPr>
         <w:t xml:space="preserve">Standardised Precipitation-Evapotranspiration Index</w:t>
       </w:r>
       <w:r>
@@ -973,9 +1478,9 @@
         <w:t xml:space="preserve">subterráneo. La sección 8.5 muestra que los datos la respaldan.</w:t>
       </w:r>
     </w:p>
-    <w:bookmarkEnd w:id="16"/>
-    <w:bookmarkEnd w:id="17"/>
-    <w:bookmarkStart w:id="20" w:name="descripción-de-los-datos"/>
+    <w:bookmarkEnd w:id="18"/>
+    <w:bookmarkEnd w:id="19"/>
+    <w:bookmarkStart w:id="22" w:name="descripción-de-los-datos"/>
     <w:p>
       <w:pPr>
         <w:pStyle w:val="Heading1"/>
@@ -1276,7 +1781,7 @@
         </w:tc>
       </w:tr>
     </w:tbl>
-    <w:bookmarkStart w:id="18" w:name="variables"/>
+    <w:bookmarkStart w:id="20" w:name="variables"/>
     <w:p>
       <w:pPr>
         <w:pStyle w:val="Heading2"/>
@@ -1864,8 +2369,8 @@
         <w:t xml:space="preserve">como volumen físico.</w:t>
       </w:r>
     </w:p>
-    <w:bookmarkEnd w:id="18"/>
-    <w:bookmarkStart w:id="19" w:name="verificación-de-la-variable-objetivo"/>
+    <w:bookmarkEnd w:id="20"/>
+    <w:bookmarkStart w:id="21" w:name="verificación-de-la-variable-objetivo"/>
     <w:p>
       <w:pPr>
         <w:pStyle w:val="Heading2"/>
@@ -1982,9 +2487,9 @@
         <w:t xml:space="preserve">.</w:t>
       </w:r>
     </w:p>
-    <w:bookmarkEnd w:id="19"/>
-    <w:bookmarkEnd w:id="20"/>
-    <w:bookmarkStart w:id="21" w:name="limpieza-y-preprocesamiento"/>
+    <w:bookmarkEnd w:id="21"/>
+    <w:bookmarkEnd w:id="22"/>
+    <w:bookmarkStart w:id="23" w:name="limpieza-y-preprocesamiento"/>
     <w:p>
       <w:pPr>
         <w:pStyle w:val="Heading1"/>
@@ -2293,8 +2798,8 @@
         <w:t xml:space="preserve">. La justificación se detalla en la sección 8.3.</w:t>
       </w:r>
     </w:p>
-    <w:bookmarkEnd w:id="21"/>
-    <w:bookmarkStart w:id="44" w:name="análisis-exploratorio"/>
+    <w:bookmarkEnd w:id="23"/>
+    <w:bookmarkStart w:id="46" w:name="análisis-exploratorio"/>
     <w:p>
       <w:pPr>
         <w:pStyle w:val="Heading1"/>
@@ -2303,7 +2808,7 @@
         <w:t xml:space="preserve">8. Análisis exploratorio</w:t>
       </w:r>
     </w:p>
-    <w:bookmarkStart w:id="25" w:name="Xa76f0e5d7f5991fb31e8ec4a52f735e17bfecf4"/>
+    <w:bookmarkStart w:id="27" w:name="Xa76f0e5d7f5991fb31e8ec4a52f735e17bfecf4"/>
     <w:p>
       <w:pPr>
         <w:pStyle w:val="Heading2"/>
@@ -2337,7 +2842,7 @@
         <w:pStyle w:val="Compact"/>
         <w:numPr>
           <w:ilvl w:val="0"/>
-          <w:numId w:val="1002"/>
+          <w:numId w:val="1007"/>
         </w:numPr>
       </w:pPr>
       <w:r>
@@ -2405,7 +2910,7 @@
         <w:pStyle w:val="Compact"/>
         <w:numPr>
           <w:ilvl w:val="0"/>
-          <w:numId w:val="1002"/>
+          <w:numId w:val="1007"/>
         </w:numPr>
       </w:pPr>
       <w:r>
@@ -2423,7 +2928,7 @@
         <w:pStyle w:val="Compact"/>
         <w:numPr>
           <w:ilvl w:val="0"/>
-          <w:numId w:val="1002"/>
+          <w:numId w:val="1007"/>
         </w:numPr>
       </w:pPr>
       <w:r>
@@ -2445,18 +2950,18 @@
           <wp:inline>
             <wp:extent cx="5334000" cy="2111700"/>
             <wp:effectExtent b="0" l="0" r="0" t="0"/>
-            <wp:docPr descr="Cobertura temporal del conjunto de entrenamiento. Los años 2004 a 2010 están completos; 2011 a 2014 pierden entre 4 y 5 meses cada uno." title="" id="23" name="Picture"/>
+            <wp:docPr descr="Cobertura temporal del conjunto de entrenamiento. Los años 2004 a 2010 están completos; 2011 a 2014 pierden entre 4 y 5 meses cada uno." title="" id="25" name="Picture"/>
             <a:graphic>
               <a:graphicData uri="http://schemas.openxmlformats.org/drawingml/2006/picture">
                 <pic:pic>
                   <pic:nvPicPr>
-                    <pic:cNvPr descr="../figures/10_cobertura_temporal.png" id="24" name="Picture"/>
+                    <pic:cNvPr descr="../figures/10_cobertura_temporal.png" id="26" name="Picture"/>
                     <pic:cNvPicPr>
                       <a:picLocks noChangeArrowheads="1" noChangeAspect="1"/>
                     </pic:cNvPicPr>
                   </pic:nvPicPr>
                   <pic:blipFill>
-                    <a:blip r:embed="rId22"/>
+                    <a:blip r:embed="rId24"/>
                     <a:stretch>
                       <a:fillRect/>
                     </a:stretch>
@@ -2573,8 +3078,8 @@
         <w:t xml:space="preserve">revele el objetivo oculto de otra.</w:t>
       </w:r>
     </w:p>
-    <w:bookmarkEnd w:id="25"/>
-    <w:bookmarkStart w:id="26" w:name="distribuciones-y-estadística-descriptiva"/>
+    <w:bookmarkEnd w:id="27"/>
+    <w:bookmarkStart w:id="28" w:name="distribuciones-y-estadística-descriptiva"/>
     <w:p>
       <w:pPr>
         <w:pStyle w:val="Heading2"/>
@@ -3350,8 +3855,8 @@
         <w:t xml:space="preserve">(IQR 0.948) pero con el rango más amplio (10.49).</w:t>
       </w:r>
     </w:p>
-    <w:bookmarkEnd w:id="26"/>
-    <w:bookmarkStart w:id="27" w:name="valores-atípicos"/>
+    <w:bookmarkEnd w:id="28"/>
+    <w:bookmarkStart w:id="29" w:name="valores-atípicos"/>
     <w:p>
       <w:pPr>
         <w:pStyle w:val="Heading2"/>
@@ -3768,8 +4273,8 @@
         <w:t xml:space="preserve">extremos los que el reto busca anticipar.</w:t>
       </w:r>
     </w:p>
-    <w:bookmarkEnd w:id="27"/>
-    <w:bookmarkStart w:id="34" w:name="comportamiento-temporal-y-estacionalidad"/>
+    <w:bookmarkEnd w:id="29"/>
+    <w:bookmarkStart w:id="36" w:name="comportamiento-temporal-y-estacionalidad"/>
     <w:p>
       <w:pPr>
         <w:pStyle w:val="Heading2"/>
@@ -3876,18 +4381,18 @@
           <wp:inline>
             <wp:extent cx="5334000" cy="2124363"/>
             <wp:effectExtent b="0" l="0" r="0" t="0"/>
-            <wp:docPr descr="Serie global, media móvil de 12 meses y desviación estándar móvil. La media móvil deja a la vista la tendencia descendente." title="" id="29" name="Picture"/>
+            <wp:docPr descr="Serie global, media móvil de 12 meses y desviación estándar móvil. La media móvil deja a la vista la tendencia descendente." title="" id="31" name="Picture"/>
             <a:graphic>
               <a:graphicData uri="http://schemas.openxmlformats.org/drawingml/2006/picture">
                 <pic:pic>
                   <pic:nvPicPr>
-                    <pic:cNvPr descr="../figures/16_media_movil.png" id="30" name="Picture"/>
+                    <pic:cNvPr descr="../figures/16_media_movil.png" id="32" name="Picture"/>
                     <pic:cNvPicPr>
                       <a:picLocks noChangeArrowheads="1" noChangeAspect="1"/>
                     </pic:cNvPicPr>
                   </pic:nvPicPr>
                   <pic:blipFill>
-                    <a:blip r:embed="rId28"/>
+                    <a:blip r:embed="rId30"/>
                     <a:stretch>
                       <a:fillRect/>
                     </a:stretch>
@@ -4201,18 +4706,18 @@
           <wp:inline>
             <wp:extent cx="5334000" cy="1638165"/>
             <wp:effectExtent b="0" l="0" r="0" t="0"/>
-            <wp:docPr descr="Perfil estacional por hemisferio. El norte promedia positivo los doce meses y el sur cae hasta −0.105 en junio: los ciclos opuestos se cancelan en el promedio global." title="" id="32" name="Picture"/>
+            <wp:docPr descr="Perfil estacional por hemisferio. El norte promedia positivo los doce meses y el sur cae hasta −0.105 en junio: los ciclos opuestos se cancelan en el promedio global." title="" id="34" name="Picture"/>
             <a:graphic>
               <a:graphicData uri="http://schemas.openxmlformats.org/drawingml/2006/picture">
                 <pic:pic>
                   <pic:nvPicPr>
-                    <pic:cNvPr descr="../figures/17_perfil_estacional.png" id="33" name="Picture"/>
+                    <pic:cNvPr descr="../figures/17_perfil_estacional.png" id="35" name="Picture"/>
                     <pic:cNvPicPr>
                       <a:picLocks noChangeArrowheads="1" noChangeAspect="1"/>
                     </pic:cNvPicPr>
                   </pic:nvPicPr>
                   <pic:blipFill>
-                    <a:blip r:embed="rId31"/>
+                    <a:blip r:embed="rId33"/>
                     <a:stretch>
                       <a:fillRect/>
                     </a:stretch>
@@ -4279,8 +4784,8 @@
         <w:t xml:space="preserve">objeto adecuado para estudiar la estacionalidad de este fenómeno.</w:t>
       </w:r>
     </w:p>
-    <w:bookmarkEnd w:id="34"/>
-    <w:bookmarkStart w:id="38" w:name="análisis-espacial"/>
+    <w:bookmarkEnd w:id="36"/>
+    <w:bookmarkStart w:id="40" w:name="análisis-espacial"/>
     <w:p>
       <w:pPr>
         <w:pStyle w:val="Heading2"/>
@@ -4334,18 +4839,18 @@
           <wp:inline>
             <wp:extent cx="5334000" cy="2895263"/>
             <wp:effectExtent b="0" l="0" r="0" t="0"/>
-            <wp:docPr descr="Promedio de la variable objetivo por celda de la rejilla. La estructura espacial es continua y coherente, con valores bajos en el norte de África y el sur de Asia." title="" id="36" name="Picture"/>
+            <wp:docPr descr="Promedio de la variable objetivo por celda de la rejilla. La estructura espacial es continua y coherente, con valores bajos en el norte de África y el sur de Asia." title="" id="38" name="Picture"/>
             <a:graphic>
               <a:graphicData uri="http://schemas.openxmlformats.org/drawingml/2006/picture">
                 <pic:pic>
                   <pic:nvPicPr>
-                    <pic:cNvPr descr="../figures/18_mapa_promedio.png" id="37" name="Picture"/>
+                    <pic:cNvPr descr="../figures/18_mapa_promedio.png" id="39" name="Picture"/>
                     <pic:cNvPicPr>
                       <a:picLocks noChangeArrowheads="1" noChangeAspect="1"/>
                     </pic:cNvPicPr>
                   </pic:nvPicPr>
                   <pic:blipFill>
-                    <a:blip r:embed="rId35"/>
+                    <a:blip r:embed="rId37"/>
                     <a:stretch>
                       <a:fillRect/>
                     </a:stretch>
@@ -4822,8 +5327,8 @@
         <w:t xml:space="preserve">desviación estándar.</w:t>
       </w:r>
     </w:p>
-    <w:bookmarkEnd w:id="38"/>
-    <w:bookmarkStart w:id="42" w:name="correlaciones"/>
+    <w:bookmarkEnd w:id="40"/>
+    <w:bookmarkStart w:id="44" w:name="correlaciones"/>
     <w:p>
       <w:pPr>
         <w:pStyle w:val="Heading2"/>
@@ -5231,18 +5736,18 @@
           <wp:inline>
             <wp:extent cx="5334000" cy="4691529"/>
             <wp:effectExtent b="0" l="0" r="0" t="0"/>
-            <wp:docPr descr="Matriz de correlación de Pearson entre las variables numéricas." title="" id="40" name="Picture"/>
+            <wp:docPr descr="Matriz de correlación de Pearson entre las variables numéricas." title="" id="42" name="Picture"/>
             <a:graphic>
               <a:graphicData uri="http://schemas.openxmlformats.org/drawingml/2006/picture">
                 <pic:pic>
                   <pic:nvPicPr>
-                    <pic:cNvPr descr="../figures/19_matriz_correlacion.png" id="41" name="Picture"/>
+                    <pic:cNvPr descr="../figures/19_matriz_correlacion.png" id="43" name="Picture"/>
                     <pic:cNvPicPr>
                       <a:picLocks noChangeArrowheads="1" noChangeAspect="1"/>
                     </pic:cNvPicPr>
                   </pic:nvPicPr>
                   <pic:blipFill>
-                    <a:blip r:embed="rId39"/>
+                    <a:blip r:embed="rId41"/>
                     <a:stretch>
                       <a:fillRect/>
                     </a:stretch>
@@ -5398,8 +5903,8 @@
         <w:t xml:space="preserve">umbral concreto que cualquier modelo debe superar.</w:t>
       </w:r>
     </w:p>
-    <w:bookmarkEnd w:id="42"/>
-    <w:bookmarkStart w:id="43" w:name="categorías-de-sequía"/>
+    <w:bookmarkEnd w:id="44"/>
+    <w:bookmarkStart w:id="45" w:name="categorías-de-sequía"/>
     <w:p>
       <w:pPr>
         <w:pStyle w:val="Heading2"/>
@@ -5506,9 +6011,9 @@
         <w:t xml:space="preserve">0.930), señal de que el SPEI por sí solo está lejos de determinar el resultado.</w:t>
       </w:r>
     </w:p>
-    <w:bookmarkEnd w:id="43"/>
-    <w:bookmarkEnd w:id="44"/>
-    <w:bookmarkStart w:id="45" w:name="hallazgos"/>
+    <w:bookmarkEnd w:id="45"/>
+    <w:bookmarkEnd w:id="46"/>
+    <w:bookmarkStart w:id="47" w:name="hallazgos"/>
     <w:p>
       <w:pPr>
         <w:pStyle w:val="Heading1"/>
@@ -5522,7 +6027,7 @@
         <w:pStyle w:val="Compact"/>
         <w:numPr>
           <w:ilvl w:val="0"/>
-          <w:numId w:val="1003"/>
+          <w:numId w:val="1008"/>
         </w:numPr>
       </w:pPr>
       <w:r>
@@ -5550,7 +6055,7 @@
         <w:pStyle w:val="Compact"/>
         <w:numPr>
           <w:ilvl w:val="0"/>
-          <w:numId w:val="1003"/>
+          <w:numId w:val="1008"/>
         </w:numPr>
       </w:pPr>
       <w:r>
@@ -5578,7 +6083,7 @@
         <w:pStyle w:val="Compact"/>
         <w:numPr>
           <w:ilvl w:val="0"/>
-          <w:numId w:val="1003"/>
+          <w:numId w:val="1008"/>
         </w:numPr>
       </w:pPr>
       <w:r>
@@ -5633,7 +6138,7 @@
         <w:pStyle w:val="Compact"/>
         <w:numPr>
           <w:ilvl w:val="0"/>
-          <w:numId w:val="1003"/>
+          <w:numId w:val="1008"/>
         </w:numPr>
       </w:pPr>
       <w:r>
@@ -5658,7 +6163,7 @@
         <w:pStyle w:val="Compact"/>
         <w:numPr>
           <w:ilvl w:val="0"/>
-          <w:numId w:val="1003"/>
+          <w:numId w:val="1008"/>
         </w:numPr>
       </w:pPr>
       <w:r>
@@ -5686,7 +6191,7 @@
         <w:pStyle w:val="Compact"/>
         <w:numPr>
           <w:ilvl w:val="0"/>
-          <w:numId w:val="1003"/>
+          <w:numId w:val="1008"/>
         </w:numPr>
       </w:pPr>
       <w:r>
@@ -5714,7 +6219,7 @@
         <w:pStyle w:val="Compact"/>
         <w:numPr>
           <w:ilvl w:val="0"/>
-          <w:numId w:val="1003"/>
+          <w:numId w:val="1008"/>
         </w:numPr>
       </w:pPr>
       <w:r>
@@ -5742,7 +6247,7 @@
         <w:pStyle w:val="Compact"/>
         <w:numPr>
           <w:ilvl w:val="0"/>
-          <w:numId w:val="1003"/>
+          <w:numId w:val="1008"/>
         </w:numPr>
       </w:pPr>
       <w:r>
@@ -5765,8 +6270,8 @@
         <w:t xml:space="preserve">escalas largas del SPEI; la línea base a superar es RMSE 0.5724.</w:t>
       </w:r>
     </w:p>
-    <w:bookmarkEnd w:id="45"/>
-    <w:bookmarkStart w:id="46" w:name="conclusiones"/>
+    <w:bookmarkEnd w:id="47"/>
+    <w:bookmarkStart w:id="48" w:name="conclusiones"/>
     <w:p>
       <w:pPr>
         <w:pStyle w:val="Heading1"/>
@@ -5900,8 +6405,8 @@
         <w:t xml:space="preserve">.</w:t>
       </w:r>
     </w:p>
-    <w:bookmarkEnd w:id="46"/>
-    <w:bookmarkStart w:id="47" w:name="próximos-pasos"/>
+    <w:bookmarkEnd w:id="48"/>
+    <w:bookmarkStart w:id="49" w:name="próximos-pasos"/>
     <w:p>
       <w:pPr>
         <w:pStyle w:val="Heading1"/>
@@ -5915,7 +6420,7 @@
         <w:pStyle w:val="Compact"/>
         <w:numPr>
           <w:ilvl w:val="0"/>
-          <w:numId w:val="1004"/>
+          <w:numId w:val="1009"/>
         </w:numPr>
       </w:pPr>
       <w:r>
@@ -5940,7 +6445,7 @@
         <w:pStyle w:val="Compact"/>
         <w:numPr>
           <w:ilvl w:val="0"/>
-          <w:numId w:val="1004"/>
+          <w:numId w:val="1009"/>
         </w:numPr>
       </w:pPr>
       <w:r>
@@ -5986,7 +6491,7 @@
         <w:pStyle w:val="Compact"/>
         <w:numPr>
           <w:ilvl w:val="0"/>
-          <w:numId w:val="1004"/>
+          <w:numId w:val="1009"/>
         </w:numPr>
       </w:pPr>
       <w:r>
@@ -6020,7 +6525,7 @@
         <w:pStyle w:val="Compact"/>
         <w:numPr>
           <w:ilvl w:val="0"/>
-          <w:numId w:val="1004"/>
+          <w:numId w:val="1009"/>
         </w:numPr>
       </w:pPr>
       <w:r>
@@ -6045,7 +6550,7 @@
         <w:pStyle w:val="Compact"/>
         <w:numPr>
           <w:ilvl w:val="0"/>
-          <w:numId w:val="1004"/>
+          <w:numId w:val="1009"/>
         </w:numPr>
       </w:pPr>
       <w:r>
@@ -6111,7 +6616,7 @@
         <w:pStyle w:val="Compact"/>
         <w:numPr>
           <w:ilvl w:val="0"/>
-          <w:numId w:val="1004"/>
+          <w:numId w:val="1009"/>
         </w:numPr>
       </w:pPr>
       <w:r>
@@ -6136,7 +6641,7 @@
         <w:pStyle w:val="Compact"/>
         <w:numPr>
           <w:ilvl w:val="0"/>
-          <w:numId w:val="1004"/>
+          <w:numId w:val="1009"/>
         </w:numPr>
       </w:pPr>
       <w:r>
@@ -6174,8 +6679,8 @@
         <w:t xml:space="preserve">debe reproducirse en la validación.</w:t>
       </w:r>
     </w:p>
-    <w:bookmarkEnd w:id="47"/>
-    <w:bookmarkStart w:id="51" w:name="referencias"/>
+    <w:bookmarkEnd w:id="49"/>
+    <w:bookmarkStart w:id="53" w:name="referencias"/>
     <w:p>
       <w:pPr>
         <w:pStyle w:val="Heading1"/>
@@ -6189,7 +6694,7 @@
         <w:pStyle w:val="Compact"/>
         <w:numPr>
           <w:ilvl w:val="0"/>
-          <w:numId w:val="1005"/>
+          <w:numId w:val="1010"/>
         </w:numPr>
       </w:pPr>
       <w:r>
@@ -6222,7 +6727,7 @@
       <w:r>
         <w:t xml:space="preserve"> </w:t>
       </w:r>
-      <w:hyperlink r:id="rId48">
+      <w:hyperlink r:id="rId50">
         <w:r>
           <w:rPr>
             <w:rStyle w:val="Hyperlink"/>
@@ -6236,7 +6741,7 @@
         <w:pStyle w:val="Compact"/>
         <w:numPr>
           <w:ilvl w:val="0"/>
-          <w:numId w:val="1005"/>
+          <w:numId w:val="1010"/>
         </w:numPr>
       </w:pPr>
       <w:r>
@@ -6270,7 +6775,7 @@
         <w:pStyle w:val="Compact"/>
         <w:numPr>
           <w:ilvl w:val="0"/>
-          <w:numId w:val="1005"/>
+          <w:numId w:val="1010"/>
         </w:numPr>
       </w:pPr>
       <w:r>
@@ -6303,7 +6808,7 @@
       <w:r>
         <w:t xml:space="preserve"> </w:t>
       </w:r>
-      <w:hyperlink r:id="rId49">
+      <w:hyperlink r:id="rId51">
         <w:r>
           <w:rPr>
             <w:rStyle w:val="Hyperlink"/>
@@ -6317,7 +6822,7 @@
         <w:pStyle w:val="Compact"/>
         <w:numPr>
           <w:ilvl w:val="0"/>
-          <w:numId w:val="1005"/>
+          <w:numId w:val="1010"/>
         </w:numPr>
       </w:pPr>
       <w:r>
@@ -6350,7 +6855,7 @@
       <w:r>
         <w:t xml:space="preserve"> </w:t>
       </w:r>
-      <w:hyperlink r:id="rId50">
+      <w:hyperlink r:id="rId52">
         <w:r>
           <w:rPr>
             <w:rStyle w:val="Hyperlink"/>
@@ -6364,7 +6869,7 @@
         <w:pStyle w:val="Compact"/>
         <w:numPr>
           <w:ilvl w:val="0"/>
-          <w:numId w:val="1005"/>
+          <w:numId w:val="1010"/>
         </w:numPr>
       </w:pPr>
       <w:r>
@@ -6403,7 +6908,7 @@
         <w:pStyle w:val="Compact"/>
         <w:numPr>
           <w:ilvl w:val="0"/>
-          <w:numId w:val="1005"/>
+          <w:numId w:val="1010"/>
         </w:numPr>
       </w:pPr>
       <w:r>
@@ -6452,7 +6957,7 @@
         <w:t xml:space="preserve">.</w:t>
       </w:r>
     </w:p>
-    <w:bookmarkEnd w:id="51"/>
+    <w:bookmarkEnd w:id="53"/>
     <w:sectPr>
       <w:footnotePr>
         <w:numRestart w:val="eachSect"/>
@@ -6788,6 +7293,15 @@
     <w:abstractNumId w:val="991"/>
   </w:num>
   <w:num w:numId="1003">
+    <w:abstractNumId w:val="991"/>
+  </w:num>
+  <w:num w:numId="1004">
+    <w:abstractNumId w:val="991"/>
+  </w:num>
+  <w:num w:numId="1005">
+    <w:abstractNumId w:val="991"/>
+  </w:num>
+  <w:num w:numId="1006">
     <w:abstractNumId w:val="99411"/>
     <w:lvlOverride w:ilvl="0">
       <w:startOverride w:val="1"/>
@@ -6817,7 +7331,10 @@
       <w:startOverride w:val="1"/>
     </w:lvlOverride>
   </w:num>
-  <w:num w:numId="1004">
+  <w:num w:numId="1007">
+    <w:abstractNumId w:val="991"/>
+  </w:num>
+  <w:num w:numId="1008">
     <w:abstractNumId w:val="99411"/>
     <w:lvlOverride w:ilvl="0">
       <w:startOverride w:val="1"/>
@@ -6847,7 +7364,37 @@
       <w:startOverride w:val="1"/>
     </w:lvlOverride>
   </w:num>
-  <w:num w:numId="1005">
+  <w:num w:numId="1009">
+    <w:abstractNumId w:val="99411"/>
+    <w:lvlOverride w:ilvl="0">
+      <w:startOverride w:val="1"/>
+    </w:lvlOverride>
+    <w:lvlOverride w:ilvl="1">
+      <w:startOverride w:val="1"/>
+    </w:lvlOverride>
+    <w:lvlOverride w:ilvl="2">
+      <w:startOverride w:val="1"/>
+    </w:lvlOverride>
+    <w:lvlOverride w:ilvl="3">
+      <w:startOverride w:val="1"/>
+    </w:lvlOverride>
+    <w:lvlOverride w:ilvl="4">
+      <w:startOverride w:val="1"/>
+    </w:lvlOverride>
+    <w:lvlOverride w:ilvl="5">
+      <w:startOverride w:val="1"/>
+    </w:lvlOverride>
+    <w:lvlOverride w:ilvl="6">
+      <w:startOverride w:val="1"/>
+    </w:lvlOverride>
+    <w:lvlOverride w:ilvl="7">
+      <w:startOverride w:val="1"/>
+    </w:lvlOverride>
+    <w:lvlOverride w:ilvl="8">
+      <w:startOverride w:val="1"/>
+    </w:lvlOverride>
+  </w:num>
+  <w:num w:numId="1010">
     <w:abstractNumId w:val="991"/>
   </w:num>
 </w:numbering>
@@ -7515,6 +8062,7 @@
     <w:link w:val="VerbatimChar"/>
     <w:pPr>
       <w:wordWrap w:val="off"/>
+      <w:shd w:val="clear" w:fill="f8f8f8"/>
     </w:pPr>
   </w:style>
   <w:style w:type="character" w:customStyle="1" w:styleId="KeywordTok">
@@ -7522,85 +8070,96 @@
     <w:basedOn w:val="VerbatimChar"/>
     <w:rPr>
       <w:b/>
-      <w:color w:val="007020"/>
+      <w:color w:val="204a87"/>
+      <w:shd w:val="clear" w:fill="f8f8f8"/>
     </w:rPr>
   </w:style>
   <w:style w:type="character" w:customStyle="1" w:styleId="DataTypeTok">
     <w:name w:val="DataTypeTok"/>
     <w:basedOn w:val="VerbatimChar"/>
     <w:rPr>
-      <w:color w:val="902000"/>
+      <w:color w:val="204a87"/>
+      <w:shd w:val="clear" w:fill="f8f8f8"/>
     </w:rPr>
   </w:style>
   <w:style w:type="character" w:customStyle="1" w:styleId="DecValTok">
     <w:name w:val="DecValTok"/>
     <w:basedOn w:val="VerbatimChar"/>
     <w:rPr>
-      <w:color w:val="40a070"/>
+      <w:color w:val="0000cf"/>
+      <w:shd w:val="clear" w:fill="f8f8f8"/>
     </w:rPr>
   </w:style>
   <w:style w:type="character" w:customStyle="1" w:styleId="BaseNTok">
     <w:name w:val="BaseNTok"/>
     <w:basedOn w:val="VerbatimChar"/>
     <w:rPr>
-      <w:color w:val="40a070"/>
+      <w:color w:val="0000cf"/>
+      <w:shd w:val="clear" w:fill="f8f8f8"/>
     </w:rPr>
   </w:style>
   <w:style w:type="character" w:customStyle="1" w:styleId="FloatTok">
     <w:name w:val="FloatTok"/>
     <w:basedOn w:val="VerbatimChar"/>
     <w:rPr>
-      <w:color w:val="40a070"/>
+      <w:color w:val="0000cf"/>
+      <w:shd w:val="clear" w:fill="f8f8f8"/>
     </w:rPr>
   </w:style>
   <w:style w:type="character" w:customStyle="1" w:styleId="ConstantTok">
     <w:name w:val="ConstantTok"/>
     <w:basedOn w:val="VerbatimChar"/>
     <w:rPr>
-      <w:color w:val="880000"/>
+      <w:color w:val="8f5902"/>
+      <w:shd w:val="clear" w:fill="f8f8f8"/>
     </w:rPr>
   </w:style>
   <w:style w:type="character" w:customStyle="1" w:styleId="CharTok">
     <w:name w:val="CharTok"/>
     <w:basedOn w:val="VerbatimChar"/>
     <w:rPr>
-      <w:color w:val="4070a0"/>
+      <w:color w:val="4e9a06"/>
+      <w:shd w:val="clear" w:fill="f8f8f8"/>
     </w:rPr>
   </w:style>
   <w:style w:type="character" w:customStyle="1" w:styleId="SpecialCharTok">
     <w:name w:val="SpecialCharTok"/>
     <w:basedOn w:val="VerbatimChar"/>
     <w:rPr>
-      <w:color w:val="4070a0"/>
+      <w:b/>
+      <w:color w:val="ce5c00"/>
+      <w:shd w:val="clear" w:fill="f8f8f8"/>
     </w:rPr>
   </w:style>
   <w:style w:type="character" w:customStyle="1" w:styleId="StringTok">
     <w:name w:val="StringTok"/>
     <w:basedOn w:val="VerbatimChar"/>
     <w:rPr>
-      <w:color w:val="4070a0"/>
+      <w:color w:val="4e9a06"/>
+      <w:shd w:val="clear" w:fill="f8f8f8"/>
     </w:rPr>
   </w:style>
   <w:style w:type="character" w:customStyle="1" w:styleId="VerbatimStringTok">
     <w:name w:val="VerbatimStringTok"/>
     <w:basedOn w:val="VerbatimChar"/>
     <w:rPr>
-      <w:color w:val="4070a0"/>
+      <w:color w:val="4e9a06"/>
+      <w:shd w:val="clear" w:fill="f8f8f8"/>
     </w:rPr>
   </w:style>
   <w:style w:type="character" w:customStyle="1" w:styleId="SpecialStringTok">
     <w:name w:val="SpecialStringTok"/>
     <w:basedOn w:val="VerbatimChar"/>
     <w:rPr>
-      <w:color w:val="bb6688"/>
+      <w:color w:val="4e9a06"/>
+      <w:shd w:val="clear" w:fill="f8f8f8"/>
     </w:rPr>
   </w:style>
   <w:style w:type="character" w:customStyle="1" w:styleId="ImportTok">
     <w:name w:val="ImportTok"/>
     <w:basedOn w:val="VerbatimChar"/>
     <w:rPr>
-      <w:b/>
-      <w:color w:val="008000"/>
+      <w:shd w:val="clear" w:fill="f8f8f8"/>
     </w:rPr>
   </w:style>
   <w:style w:type="character" w:customStyle="1" w:styleId="CommentTok">
@@ -7608,15 +8167,18 @@
     <w:basedOn w:val="VerbatimChar"/>
     <w:rPr>
       <w:i/>
-      <w:color w:val="60a0b0"/>
+      <w:color w:val="8f5902"/>
+      <w:shd w:val="clear" w:fill="f8f8f8"/>
     </w:rPr>
   </w:style>
   <w:style w:type="character" w:customStyle="1" w:styleId="DocumentationTok">
     <w:name w:val="DocumentationTok"/>
     <w:basedOn w:val="VerbatimChar"/>
     <w:rPr>
+      <w:b/>
       <w:i/>
-      <w:color w:val="ba2121"/>
+      <w:color w:val="8f5902"/>
+      <w:shd w:val="clear" w:fill="f8f8f8"/>
     </w:rPr>
   </w:style>
   <w:style w:type="character" w:customStyle="1" w:styleId="AnnotationTok">
@@ -7625,7 +8187,8 @@
     <w:rPr>
       <w:b/>
       <w:i/>
-      <w:color w:val="60a0b0"/>
+      <w:color w:val="8f5902"/>
+      <w:shd w:val="clear" w:fill="f8f8f8"/>
     </w:rPr>
   </w:style>
   <w:style w:type="character" w:customStyle="1" w:styleId="CommentVarTok">
@@ -7634,28 +8197,33 @@
     <w:rPr>
       <w:b/>
       <w:i/>
-      <w:color w:val="60a0b0"/>
+      <w:color w:val="8f5902"/>
+      <w:shd w:val="clear" w:fill="f8f8f8"/>
     </w:rPr>
   </w:style>
   <w:style w:type="character" w:customStyle="1" w:styleId="OtherTok">
     <w:name w:val="OtherTok"/>
     <w:basedOn w:val="VerbatimChar"/>
     <w:rPr>
-      <w:color w:val="007020"/>
+      <w:color w:val="8f5902"/>
+      <w:shd w:val="clear" w:fill="f8f8f8"/>
     </w:rPr>
   </w:style>
   <w:style w:type="character" w:customStyle="1" w:styleId="FunctionTok">
     <w:name w:val="FunctionTok"/>
     <w:basedOn w:val="VerbatimChar"/>
     <w:rPr>
-      <w:color w:val="06287e"/>
+      <w:b/>
+      <w:color w:val="204a87"/>
+      <w:shd w:val="clear" w:fill="f8f8f8"/>
     </w:rPr>
   </w:style>
   <w:style w:type="character" w:customStyle="1" w:styleId="VariableTok">
     <w:name w:val="VariableTok"/>
     <w:basedOn w:val="VerbatimChar"/>
     <w:rPr>
-      <w:color w:val="19177c"/>
+      <w:color w:val="000000"/>
+      <w:shd w:val="clear" w:fill="f8f8f8"/>
     </w:rPr>
   </w:style>
   <w:style w:type="character" w:customStyle="1" w:styleId="ControlFlowTok">
@@ -7663,46 +8231,56 @@
     <w:basedOn w:val="VerbatimChar"/>
     <w:rPr>
       <w:b/>
-      <w:color w:val="007020"/>
+      <w:color w:val="204a87"/>
+      <w:shd w:val="clear" w:fill="f8f8f8"/>
     </w:rPr>
   </w:style>
   <w:style w:type="character" w:customStyle="1" w:styleId="OperatorTok">
     <w:name w:val="OperatorTok"/>
     <w:basedOn w:val="VerbatimChar"/>
     <w:rPr>
-      <w:color w:val="666666"/>
+      <w:b/>
+      <w:color w:val="ce5c00"/>
+      <w:shd w:val="clear" w:fill="f8f8f8"/>
     </w:rPr>
   </w:style>
   <w:style w:type="character" w:customStyle="1" w:styleId="BuiltInTok">
     <w:name w:val="BuiltInTok"/>
     <w:basedOn w:val="VerbatimChar"/>
     <w:rPr>
-      <w:color w:val="008000"/>
+      <w:shd w:val="clear" w:fill="f8f8f8"/>
     </w:rPr>
   </w:style>
   <w:style w:type="character" w:customStyle="1" w:styleId="ExtensionTok">
     <w:name w:val="ExtensionTok"/>
     <w:basedOn w:val="VerbatimChar"/>
-    <w:rPr/>
+    <w:rPr>
+      <w:shd w:val="clear" w:fill="f8f8f8"/>
+    </w:rPr>
   </w:style>
   <w:style w:type="character" w:customStyle="1" w:styleId="PreprocessorTok">
     <w:name w:val="PreprocessorTok"/>
     <w:basedOn w:val="VerbatimChar"/>
     <w:rPr>
-      <w:color w:val="bc7a00"/>
+      <w:i/>
+      <w:color w:val="8f5902"/>
+      <w:shd w:val="clear" w:fill="f8f8f8"/>
     </w:rPr>
   </w:style>
   <w:style w:type="character" w:customStyle="1" w:styleId="AttributeTok">
     <w:name w:val="AttributeTok"/>
     <w:basedOn w:val="VerbatimChar"/>
     <w:rPr>
-      <w:color w:val="7d9029"/>
+      <w:color w:val="204a87"/>
+      <w:shd w:val="clear" w:fill="f8f8f8"/>
     </w:rPr>
   </w:style>
   <w:style w:type="character" w:customStyle="1" w:styleId="RegionMarkerTok">
     <w:name w:val="RegionMarkerTok"/>
     <w:basedOn w:val="VerbatimChar"/>
-    <w:rPr/>
+    <w:rPr>
+      <w:shd w:val="clear" w:fill="f8f8f8"/>
+    </w:rPr>
   </w:style>
   <w:style w:type="character" w:customStyle="1" w:styleId="InformationTok">
     <w:name w:val="InformationTok"/>
@@ -7710,7 +8288,8 @@
     <w:rPr>
       <w:b/>
       <w:i/>
-      <w:color w:val="60a0b0"/>
+      <w:color w:val="8f5902"/>
+      <w:shd w:val="clear" w:fill="f8f8f8"/>
     </w:rPr>
   </w:style>
   <w:style w:type="character" w:customStyle="1" w:styleId="WarningTok">
@@ -7719,15 +8298,16 @@
     <w:rPr>
       <w:b/>
       <w:i/>
-      <w:color w:val="60a0b0"/>
+      <w:color w:val="8f5902"/>
+      <w:shd w:val="clear" w:fill="f8f8f8"/>
     </w:rPr>
   </w:style>
   <w:style w:type="character" w:customStyle="1" w:styleId="AlertTok">
     <w:name w:val="AlertTok"/>
     <w:basedOn w:val="VerbatimChar"/>
     <w:rPr>
-      <w:b/>
-      <w:color w:val="ff0000"/>
+      <w:color w:val="ef2929"/>
+      <w:shd w:val="clear" w:fill="f8f8f8"/>
     </w:rPr>
   </w:style>
   <w:style w:type="character" w:customStyle="1" w:styleId="ErrorTok">
@@ -7735,13 +8315,16 @@
     <w:basedOn w:val="VerbatimChar"/>
     <w:rPr>
       <w:b/>
-      <w:color w:val="ff0000"/>
+      <w:color w:val="a40000"/>
+      <w:shd w:val="clear" w:fill="f8f8f8"/>
     </w:rPr>
   </w:style>
   <w:style w:type="character" w:customStyle="1" w:styleId="NormalTok">
     <w:name w:val="NormalTok"/>
     <w:basedOn w:val="VerbatimChar"/>
-    <w:rPr/>
+    <w:rPr>
+      <w:shd w:val="clear" w:fill="f8f8f8"/>
+    </w:rPr>
   </w:style>
 </w:styles>
 </file>

</xml_diff>